<commit_message>
Volume 1, Chapter 5: project-setup steps (every project created by its own tools)
</commit_message>
<xml_diff>
--- a/Volume 1/Chapter 05 - CRUD Applications/SPA_Vol1_Ch5_Lesson5_1_Create_Records.docx
+++ b/Volume 1/Chapter 05 - CRUD Applications/SPA_Vol1_Ch5_Lesson5_1_Create_Records.docx
@@ -1453,8 +1453,411 @@
       </w:pPr>
     </w:p>
     <w:p>
-      <w:r>
-        <w:t>Save each source and supporting file from this lesson into the matching path in the project layout. As in Chapter 1, notepad .\c\basic_contacts.c creates and opens one: choose Yes, type the file, save it with Ctrl+S, and close Notepad (on Linux or macOS, nano ./c/basic_contacts.c: type the file, then save and close it with Ctrl+O, Enter, then Ctrl+X).</w:t>
+      <w:pPr>
+        <w:pStyle w:val="Heading3"/>
+      </w:pPr>
+      <w:r>
+        <w:t>Windows PowerShell Project Files Setup</w:t>
+      </w:r>
+    </w:p>
+    <w:p>
+      <w:pPr>
+        <w:keepNext/>
+      </w:pPr>
+      <w:r>
+        <w:t>Next, let the tools create each project's settings file, as in Chapter 1. Remember, dotnet new console -o makes a C# project with a .csproj file and a starter Program.cs; you replace Program.cs with this lesson's code in the C# section. Remember, go mod init makes the .\go folder a module by writing .\go\go.mod; its go line shows the Go version you have installed. Remember, npm init -y, npm pkg, then npm install: npm init and npm pkg write .\typescript\package.json here, and Step 2 installs the packages.</w:t>
+      </w:r>
+    </w:p>
+    <w:p>
+      <w:pPr>
+        <w:keepNext/>
+      </w:pPr>
+    </w:p>
+    <w:p>
+      <w:pPr>
+        <w:pStyle w:val="CommandBlock"/>
+        <w:keepNext/>
+      </w:pPr>
+      <w:r>
+        <w:t>dotnet new console -o .\csharp\BasicContacts</w:t>
+      </w:r>
+    </w:p>
+    <w:p>
+      <w:pPr>
+        <w:pStyle w:val="CommandBlock"/>
+        <w:keepNext/>
+      </w:pPr>
+      <w:r>
+        <w:t>dotnet new console -o .\csharp\Contacts</w:t>
+      </w:r>
+    </w:p>
+    <w:p>
+      <w:pPr>
+        <w:pStyle w:val="CommandBlock"/>
+        <w:keepNext/>
+      </w:pPr>
+      <w:r>
+        <w:t>go -C .\go mod init example.com/createrecords</w:t>
+      </w:r>
+    </w:p>
+    <w:p>
+      <w:pPr>
+        <w:pStyle w:val="CommandBlock"/>
+        <w:keepNext/>
+      </w:pPr>
+      <w:r>
+        <w:t>Push-Location .\typescript</w:t>
+      </w:r>
+    </w:p>
+    <w:p>
+      <w:pPr>
+        <w:pStyle w:val="CommandBlock"/>
+        <w:keepNext/>
+      </w:pPr>
+      <w:r>
+        <w:t>npm init -y</w:t>
+      </w:r>
+    </w:p>
+    <w:p>
+      <w:pPr>
+        <w:pStyle w:val="CommandBlock"/>
+        <w:keepNext/>
+      </w:pPr>
+      <w:r>
+        <w:t>npm pkg set name=create-records-typescript type=module</w:t>
+      </w:r>
+    </w:p>
+    <w:p>
+      <w:pPr>
+        <w:pStyle w:val="CommandBlock"/>
+        <w:keepNext/>
+      </w:pPr>
+      <w:r>
+        <w:t>npm pkg set private=true --json</w:t>
+      </w:r>
+    </w:p>
+    <w:p>
+      <w:pPr>
+        <w:pStyle w:val="CommandBlock"/>
+        <w:keepNext/>
+      </w:pPr>
+      <w:r>
+        <w:t>npm pkg set "scripts.check=tsc --noEmit" "scripts.build=tsc --noEmitOnError"</w:t>
+      </w:r>
+    </w:p>
+    <w:p>
+      <w:pPr>
+        <w:pStyle w:val="CommandBlock"/>
+        <w:keepNext/>
+      </w:pPr>
+      <w:r>
+        <w:t>npm pkg delete version description main keywords author license scripts.test</w:t>
+      </w:r>
+    </w:p>
+    <w:p>
+      <w:pPr>
+        <w:pStyle w:val="CommandBlock"/>
+      </w:pPr>
+      <w:r>
+        <w:t>Pop-Location</w:t>
+      </w:r>
+    </w:p>
+    <w:p>
+      <w:pPr>
+        <w:keepNext/>
+      </w:pPr>
+    </w:p>
+    <w:p>
+      <w:r>
+        <w:t>Then type the TypeScript compiler settings. As in Chapter 1, notepad .\typescript\tsconfig.json creates and opens the file: choose Yes, type the file, save it with Ctrl+S, and close Notepad.</w:t>
+      </w:r>
+    </w:p>
+    <w:p>
+      <w:pPr>
+        <w:keepNext/>
+      </w:pPr>
+    </w:p>
+    <w:p>
+      <w:pPr>
+        <w:pStyle w:val="Heading3"/>
+      </w:pPr>
+      <w:r>
+        <w:t>typescript/tsconfig.json</w:t>
+      </w:r>
+    </w:p>
+    <w:p>
+      <w:pPr>
+        <w:pStyle w:val="SourceCode"/>
+        <w:keepNext/>
+      </w:pPr>
+      <w:r>
+        <w:t>{</w:t>
+      </w:r>
+    </w:p>
+    <w:p>
+      <w:pPr>
+        <w:pStyle w:val="SourceCode"/>
+        <w:keepNext/>
+      </w:pPr>
+      <w:r>
+        <w:t xml:space="preserve">  "compilerOptions": {</w:t>
+      </w:r>
+    </w:p>
+    <w:p>
+      <w:pPr>
+        <w:pStyle w:val="SourceCode"/>
+      </w:pPr>
+      <w:r>
+        <w:t xml:space="preserve">    "target": "ES2022",</w:t>
+      </w:r>
+    </w:p>
+    <w:p>
+      <w:pPr>
+        <w:pStyle w:val="SourceCode"/>
+      </w:pPr>
+      <w:r>
+        <w:t xml:space="preserve">    "module": "NodeNext",</w:t>
+      </w:r>
+    </w:p>
+    <w:p>
+      <w:pPr>
+        <w:pStyle w:val="SourceCode"/>
+      </w:pPr>
+      <w:r>
+        <w:t xml:space="preserve">    "moduleResolution": "NodeNext",</w:t>
+      </w:r>
+    </w:p>
+    <w:p>
+      <w:pPr>
+        <w:pStyle w:val="SourceCode"/>
+      </w:pPr>
+      <w:r>
+        <w:t xml:space="preserve">    "rootDir": "src",</w:t>
+      </w:r>
+    </w:p>
+    <w:p>
+      <w:pPr>
+        <w:pStyle w:val="SourceCode"/>
+      </w:pPr>
+      <w:r>
+        <w:t xml:space="preserve">    "outDir": "dist",</w:t>
+      </w:r>
+    </w:p>
+    <w:p>
+      <w:pPr>
+        <w:pStyle w:val="SourceCode"/>
+      </w:pPr>
+      <w:r>
+        <w:t xml:space="preserve">    "strict": true,</w:t>
+      </w:r>
+    </w:p>
+    <w:p>
+      <w:pPr>
+        <w:pStyle w:val="SourceCode"/>
+      </w:pPr>
+      <w:r>
+        <w:t xml:space="preserve">    "types": [</w:t>
+      </w:r>
+    </w:p>
+    <w:p>
+      <w:pPr>
+        <w:pStyle w:val="SourceCode"/>
+      </w:pPr>
+      <w:r>
+        <w:t xml:space="preserve">      "node"</w:t>
+      </w:r>
+    </w:p>
+    <w:p>
+      <w:pPr>
+        <w:pStyle w:val="SourceCode"/>
+      </w:pPr>
+      <w:r>
+        <w:t xml:space="preserve">    ],</w:t>
+      </w:r>
+    </w:p>
+    <w:p>
+      <w:pPr>
+        <w:pStyle w:val="SourceCode"/>
+      </w:pPr>
+      <w:r>
+        <w:t xml:space="preserve">    "moduleDetection": "force"</w:t>
+      </w:r>
+    </w:p>
+    <w:p>
+      <w:pPr>
+        <w:pStyle w:val="SourceCode"/>
+      </w:pPr>
+      <w:r>
+        <w:t xml:space="preserve">  },</w:t>
+      </w:r>
+    </w:p>
+    <w:p>
+      <w:pPr>
+        <w:pStyle w:val="SourceCode"/>
+      </w:pPr>
+      <w:r>
+        <w:t xml:space="preserve">  "include": [</w:t>
+      </w:r>
+    </w:p>
+    <w:p>
+      <w:pPr>
+        <w:pStyle w:val="SourceCode"/>
+        <w:keepNext/>
+      </w:pPr>
+      <w:r>
+        <w:t xml:space="preserve">    "src/**/*.ts"</w:t>
+      </w:r>
+    </w:p>
+    <w:p>
+      <w:pPr>
+        <w:pStyle w:val="SourceCode"/>
+        <w:keepNext/>
+      </w:pPr>
+      <w:r>
+        <w:t xml:space="preserve">  ]</w:t>
+      </w:r>
+    </w:p>
+    <w:p>
+      <w:pPr>
+        <w:pStyle w:val="SourceCode"/>
+      </w:pPr>
+      <w:r>
+        <w:t>}</w:t>
+      </w:r>
+    </w:p>
+    <w:p>
+      <w:pPr>
+        <w:keepNext/>
+      </w:pPr>
+    </w:p>
+    <w:p>
+      <w:r>
+        <w:t>You save each source file in its language's section below, as each is shown, the same way.</w:t>
+      </w:r>
+    </w:p>
+    <w:p>
+      <w:pPr>
+        <w:keepNext/>
+      </w:pPr>
+    </w:p>
+    <w:p>
+      <w:pPr>
+        <w:pStyle w:val="Heading3"/>
+      </w:pPr>
+      <w:r>
+        <w:t>Linux or macOS Project Files Setup</w:t>
+      </w:r>
+    </w:p>
+    <w:p>
+      <w:pPr>
+        <w:keepNext/>
+      </w:pPr>
+      <w:r>
+        <w:t>Then create the C#, Go, and TypeScript project files with the same commands as on Windows; cd moves into ./typescript for the npm lines, and cd .. moves back.</w:t>
+      </w:r>
+    </w:p>
+    <w:p>
+      <w:pPr>
+        <w:keepNext/>
+      </w:pPr>
+    </w:p>
+    <w:p>
+      <w:pPr>
+        <w:pStyle w:val="CommandBlock"/>
+        <w:keepNext/>
+      </w:pPr>
+      <w:r>
+        <w:t>dotnet new console -o ./csharp/BasicContacts</w:t>
+      </w:r>
+    </w:p>
+    <w:p>
+      <w:pPr>
+        <w:pStyle w:val="CommandBlock"/>
+        <w:keepNext/>
+      </w:pPr>
+      <w:r>
+        <w:t>dotnet new console -o ./csharp/Contacts</w:t>
+      </w:r>
+    </w:p>
+    <w:p>
+      <w:pPr>
+        <w:pStyle w:val="CommandBlock"/>
+        <w:keepNext/>
+      </w:pPr>
+      <w:r>
+        <w:t>go -C ./go mod init example.com/createrecords</w:t>
+      </w:r>
+    </w:p>
+    <w:p>
+      <w:pPr>
+        <w:pStyle w:val="CommandBlock"/>
+        <w:keepNext/>
+      </w:pPr>
+      <w:r>
+        <w:t>cd ./typescript</w:t>
+      </w:r>
+    </w:p>
+    <w:p>
+      <w:pPr>
+        <w:pStyle w:val="CommandBlock"/>
+        <w:keepNext/>
+      </w:pPr>
+      <w:r>
+        <w:t>npm init -y</w:t>
+      </w:r>
+    </w:p>
+    <w:p>
+      <w:pPr>
+        <w:pStyle w:val="CommandBlock"/>
+        <w:keepNext/>
+      </w:pPr>
+      <w:r>
+        <w:t>npm pkg set name=create-records-typescript type=module</w:t>
+      </w:r>
+    </w:p>
+    <w:p>
+      <w:pPr>
+        <w:pStyle w:val="CommandBlock"/>
+        <w:keepNext/>
+      </w:pPr>
+      <w:r>
+        <w:t>npm pkg set private=true --json</w:t>
+      </w:r>
+    </w:p>
+    <w:p>
+      <w:pPr>
+        <w:pStyle w:val="CommandBlock"/>
+        <w:keepNext/>
+      </w:pPr>
+      <w:r>
+        <w:t>npm pkg set "scripts.check=tsc --noEmit" "scripts.build=tsc --noEmitOnError"</w:t>
+      </w:r>
+    </w:p>
+    <w:p>
+      <w:pPr>
+        <w:pStyle w:val="CommandBlock"/>
+        <w:keepNext/>
+      </w:pPr>
+      <w:r>
+        <w:t>npm pkg delete version description main keywords author license scripts.test</w:t>
+      </w:r>
+    </w:p>
+    <w:p>
+      <w:pPr>
+        <w:pStyle w:val="CommandBlock"/>
+      </w:pPr>
+      <w:r>
+        <w:t>cd ..</w:t>
+      </w:r>
+    </w:p>
+    <w:p>
+      <w:pPr>
+        <w:keepNext/>
+      </w:pPr>
+    </w:p>
+    <w:p>
+      <w:r>
+        <w:t>Type typescript/tsconfig.json exactly as shown in the Windows setup. You save each source file in its language's section below, as each is shown. As in Chapter 1, nano ./c/basic_contacts.c creates and opens one: type the file, then save and close it with Ctrl+O, Enter, then Ctrl+X.</w:t>
       </w:r>
     </w:p>
     <w:p>
@@ -1486,6 +1889,16 @@
       </w:pPr>
     </w:p>
     <w:p>
+      <w:r>
+        <w:t>Remember, dotnet add writes the pinned package into the .csproj, go get pins the module in go.mod and go.sum, and npm install --save-exact pins each package in package.json. dotnet add also restores the package, so the dotnet restore lines below only check that it is there. go get lists the module as // indirect until a Go file imports it, and the build works either way; after you save the Go files, go -C .\go mod tidy rewrites go.mod to match the imports, as Supporting Files shows.</w:t>
+      </w:r>
+    </w:p>
+    <w:p>
+      <w:pPr>
+        <w:keepNext/>
+      </w:pPr>
+    </w:p>
+    <w:p>
       <w:pPr>
         <w:pStyle w:val="Heading3"/>
       </w:pPr>
@@ -1499,7 +1912,7 @@
         <w:keepNext/>
       </w:pPr>
       <w:r>
-        <w:t>npm --prefix .\typescript install --ignore-scripts --no-audit --no-fund</w:t>
+        <w:t>npm --prefix .\typescript install --save-dev --save-exact @types/node@24.13.5 `</w:t>
       </w:r>
     </w:p>
     <w:p>
@@ -1508,6 +1921,33 @@
         <w:keepNext/>
       </w:pPr>
       <w:r>
+        <w:t xml:space="preserve">    typescript@7.0.2 --ignore-scripts --no-audit --no-fund</w:t>
+      </w:r>
+    </w:p>
+    <w:p>
+      <w:pPr>
+        <w:pStyle w:val="CommandBlock"/>
+        <w:keepNext/>
+      </w:pPr>
+      <w:r>
+        <w:t>npm --prefix .\typescript install --save-exact mysql2@3.24.5 `</w:t>
+      </w:r>
+    </w:p>
+    <w:p>
+      <w:pPr>
+        <w:pStyle w:val="CommandBlock"/>
+        <w:keepNext/>
+      </w:pPr>
+      <w:r>
+        <w:t xml:space="preserve">    --ignore-scripts --no-audit --no-fund</w:t>
+      </w:r>
+    </w:p>
+    <w:p>
+      <w:pPr>
+        <w:pStyle w:val="CommandBlock"/>
+        <w:keepNext/>
+      </w:pPr>
+      <w:r>
         <w:t>py -m venv .\python\.venv</w:t>
       </w:r>
     </w:p>
@@ -1526,7 +1966,7 @@
         <w:keepNext/>
       </w:pPr>
       <w:r>
-        <w:t>go -C .\go mod tidy</w:t>
+        <w:t>go -C .\go get github.com/go-sql-driver/mysql@v1.10.1</w:t>
       </w:r>
     </w:p>
     <w:p>
@@ -1535,6 +1975,24 @@
         <w:keepNext/>
       </w:pPr>
       <w:r>
+        <w:t>dotnet add .\csharp\BasicContacts package MySqlConnector --version 2.6.2</w:t>
+      </w:r>
+    </w:p>
+    <w:p>
+      <w:pPr>
+        <w:pStyle w:val="CommandBlock"/>
+        <w:keepNext/>
+      </w:pPr>
+      <w:r>
+        <w:t>dotnet add .\csharp\Contacts package MySqlConnector --version 2.6.2</w:t>
+      </w:r>
+    </w:p>
+    <w:p>
+      <w:pPr>
+        <w:pStyle w:val="CommandBlock"/>
+        <w:keepNext/>
+      </w:pPr>
+      <w:r>
         <w:t>dotnet restore .\csharp\BasicContacts</w:t>
       </w:r>
     </w:p>
@@ -1751,7 +2209,7 @@
         <w:keepNext/>
       </w:pPr>
       <w:r>
-        <w:t>npm --prefix ./typescript install --ignore-scripts --no-audit --no-fund</w:t>
+        <w:t>npm --prefix ./typescript install --save-dev --save-exact @types/node@24.13.5 \</w:t>
       </w:r>
     </w:p>
     <w:p>
@@ -1760,6 +2218,33 @@
         <w:keepNext/>
       </w:pPr>
       <w:r>
+        <w:t xml:space="preserve">    typescript@7.0.2 --ignore-scripts --no-audit --no-fund</w:t>
+      </w:r>
+    </w:p>
+    <w:p>
+      <w:pPr>
+        <w:pStyle w:val="CommandBlock"/>
+        <w:keepNext/>
+      </w:pPr>
+      <w:r>
+        <w:t>npm --prefix ./typescript install --save-exact mysql2@3.24.5 \</w:t>
+      </w:r>
+    </w:p>
+    <w:p>
+      <w:pPr>
+        <w:pStyle w:val="CommandBlock"/>
+        <w:keepNext/>
+      </w:pPr>
+      <w:r>
+        <w:t xml:space="preserve">    --ignore-scripts --no-audit --no-fund</w:t>
+      </w:r>
+    </w:p>
+    <w:p>
+      <w:pPr>
+        <w:pStyle w:val="CommandBlock"/>
+        <w:keepNext/>
+      </w:pPr>
+      <w:r>
         <w:t>python3 -m venv ./python/.venv</w:t>
       </w:r>
     </w:p>
@@ -1778,7 +2263,7 @@
         <w:keepNext/>
       </w:pPr>
       <w:r>
-        <w:t>go -C ./go mod tidy</w:t>
+        <w:t>go -C ./go get github.com/go-sql-driver/mysql@v1.10.1</w:t>
       </w:r>
     </w:p>
     <w:p>
@@ -1787,6 +2272,24 @@
         <w:keepNext/>
       </w:pPr>
       <w:r>
+        <w:t>dotnet add ./csharp/BasicContacts package MySqlConnector --version 2.6.2</w:t>
+      </w:r>
+    </w:p>
+    <w:p>
+      <w:pPr>
+        <w:pStyle w:val="CommandBlock"/>
+        <w:keepNext/>
+      </w:pPr>
+      <w:r>
+        <w:t>dotnet add ./csharp/Contacts package MySqlConnector --version 2.6.2</w:t>
+      </w:r>
+    </w:p>
+    <w:p>
+      <w:pPr>
+        <w:pStyle w:val="CommandBlock"/>
+        <w:keepNext/>
+      </w:pPr>
+      <w:r>
         <w:t>dotnet restore ./csharp/BasicContacts</w:t>
       </w:r>
     </w:p>
@@ -36693,7 +37196,7 @@
     </w:p>
     <w:p>
       <w:r>
-        <w:t>These files are the same as in the Chapter 4 project, except that go.mod names this lesson's Go module, example.com/createrecords, and package.json names this lesson's package. Both .csproj files list MySqlConnector, and package.json lists mysql2.</w:t>
+        <w:t>These are the files the setup commands wrote, shown here so you can check yours. Your go line shows your own Go version, your mysql line says // indirect until you run go mod tidy, and the blank lines and the order of the package.json fields may differ.</w:t>
       </w:r>
     </w:p>
     <w:p>
@@ -37139,164 +37642,6 @@
       </w:pPr>
       <w:r>
         <w:t xml:space="preserve">  }</w:t>
-      </w:r>
-    </w:p>
-    <w:p>
-      <w:pPr>
-        <w:pStyle w:val="SourceCode"/>
-      </w:pPr>
-      <w:r>
-        <w:t>}</w:t>
-      </w:r>
-    </w:p>
-    <w:p>
-      <w:pPr>
-        <w:keepNext/>
-      </w:pPr>
-    </w:p>
-    <w:p>
-      <w:pPr>
-        <w:keepNext/>
-      </w:pPr>
-    </w:p>
-    <w:p>
-      <w:pPr>
-        <w:pStyle w:val="Heading2"/>
-      </w:pPr>
-      <w:r>
-        <w:t>typescript/tsconfig.json</w:t>
-      </w:r>
-    </w:p>
-    <w:p>
-      <w:pPr>
-        <w:pStyle w:val="SourceCode"/>
-        <w:keepNext/>
-      </w:pPr>
-      <w:r>
-        <w:t>{</w:t>
-      </w:r>
-    </w:p>
-    <w:p>
-      <w:pPr>
-        <w:pStyle w:val="SourceCode"/>
-        <w:keepNext/>
-      </w:pPr>
-      <w:r>
-        <w:t xml:space="preserve">  "compilerOptions": {</w:t>
-      </w:r>
-    </w:p>
-    <w:p>
-      <w:pPr>
-        <w:pStyle w:val="SourceCode"/>
-      </w:pPr>
-      <w:r>
-        <w:t xml:space="preserve">    "target": "ES2022",</w:t>
-      </w:r>
-    </w:p>
-    <w:p>
-      <w:pPr>
-        <w:pStyle w:val="SourceCode"/>
-      </w:pPr>
-      <w:r>
-        <w:t xml:space="preserve">    "module": "NodeNext",</w:t>
-      </w:r>
-    </w:p>
-    <w:p>
-      <w:pPr>
-        <w:pStyle w:val="SourceCode"/>
-      </w:pPr>
-      <w:r>
-        <w:t xml:space="preserve">    "moduleResolution": "NodeNext",</w:t>
-      </w:r>
-    </w:p>
-    <w:p>
-      <w:pPr>
-        <w:pStyle w:val="SourceCode"/>
-      </w:pPr>
-      <w:r>
-        <w:t xml:space="preserve">    "rootDir": "src",</w:t>
-      </w:r>
-    </w:p>
-    <w:p>
-      <w:pPr>
-        <w:pStyle w:val="SourceCode"/>
-      </w:pPr>
-      <w:r>
-        <w:t xml:space="preserve">    "outDir": "dist",</w:t>
-      </w:r>
-    </w:p>
-    <w:p>
-      <w:pPr>
-        <w:pStyle w:val="SourceCode"/>
-      </w:pPr>
-      <w:r>
-        <w:t xml:space="preserve">    "strict": true,</w:t>
-      </w:r>
-    </w:p>
-    <w:p>
-      <w:pPr>
-        <w:pStyle w:val="SourceCode"/>
-      </w:pPr>
-      <w:r>
-        <w:t xml:space="preserve">    "types": [</w:t>
-      </w:r>
-    </w:p>
-    <w:p>
-      <w:pPr>
-        <w:pStyle w:val="SourceCode"/>
-      </w:pPr>
-      <w:r>
-        <w:t xml:space="preserve">      "node"</w:t>
-      </w:r>
-    </w:p>
-    <w:p>
-      <w:pPr>
-        <w:pStyle w:val="SourceCode"/>
-      </w:pPr>
-      <w:r>
-        <w:t xml:space="preserve">    ],</w:t>
-      </w:r>
-    </w:p>
-    <w:p>
-      <w:pPr>
-        <w:pStyle w:val="SourceCode"/>
-      </w:pPr>
-      <w:r>
-        <w:t xml:space="preserve">    "moduleDetection": "force"</w:t>
-      </w:r>
-    </w:p>
-    <w:p>
-      <w:pPr>
-        <w:pStyle w:val="SourceCode"/>
-      </w:pPr>
-      <w:r>
-        <w:t xml:space="preserve">  },</w:t>
-      </w:r>
-    </w:p>
-    <w:p>
-      <w:pPr>
-        <w:pStyle w:val="SourceCode"/>
-      </w:pPr>
-      <w:r>
-        <w:t xml:space="preserve">  "include": [</w:t>
-      </w:r>
-    </w:p>
-    <w:p>
-      <w:pPr>
-        <w:pStyle w:val="SourceCode"/>
-        <w:keepNext/>
-      </w:pPr>
-      <w:r>
-        <w:t xml:space="preserve">    "src/**/*.ts"</w:t>
-      </w:r>
-    </w:p>
-    <w:p>
-      <w:pPr>
-        <w:pStyle w:val="SourceCode"/>
-        <w:keepNext/>
-      </w:pPr>
-      <w:r>
-        <w:t xml:space="preserve">  ]</w:t>
       </w:r>
     </w:p>
     <w:p>
@@ -39421,31 +39766,31 @@
       </w:rPr>
     </w:lvl>
   </w:abstractNum>
-  <w:num w:numId="1" w16cid:durableId="430777824">
+  <w:num w:numId="1" w16cid:durableId="1307468179">
     <w:abstractNumId w:val="8"/>
   </w:num>
-  <w:num w:numId="2" w16cid:durableId="610434990">
+  <w:num w:numId="2" w16cid:durableId="835191671">
     <w:abstractNumId w:val="6"/>
   </w:num>
-  <w:num w:numId="3" w16cid:durableId="151652531">
+  <w:num w:numId="3" w16cid:durableId="1653943680">
     <w:abstractNumId w:val="5"/>
   </w:num>
-  <w:num w:numId="4" w16cid:durableId="1445029611">
+  <w:num w:numId="4" w16cid:durableId="1735274266">
     <w:abstractNumId w:val="4"/>
   </w:num>
-  <w:num w:numId="5" w16cid:durableId="894782654">
+  <w:num w:numId="5" w16cid:durableId="1196966653">
     <w:abstractNumId w:val="7"/>
   </w:num>
-  <w:num w:numId="6" w16cid:durableId="1003314503">
+  <w:num w:numId="6" w16cid:durableId="538399421">
     <w:abstractNumId w:val="3"/>
   </w:num>
-  <w:num w:numId="7" w16cid:durableId="61604554">
+  <w:num w:numId="7" w16cid:durableId="229266836">
     <w:abstractNumId w:val="2"/>
   </w:num>
-  <w:num w:numId="8" w16cid:durableId="2020423926">
+  <w:num w:numId="8" w16cid:durableId="1887184470">
     <w:abstractNumId w:val="1"/>
   </w:num>
-  <w:num w:numId="9" w16cid:durableId="1600062426">
+  <w:num w:numId="9" w16cid:durableId="651567117">
     <w:abstractNumId w:val="0"/>
   </w:num>
 </w:numbering>

</xml_diff>

<commit_message>
Volume 1, Chapter 5: each language uses its own tables; project-setup steps
</commit_message>
<xml_diff>
--- a/Volume 1/Chapter 05 - CRUD Applications/SPA_Vol1_Ch5_Lesson5_1_Create_Records.docx
+++ b/Volume 1/Chapter 05 - CRUD Applications/SPA_Vol1_Ch5_Lesson5_1_Create_Records.docx
@@ -314,7 +314,7 @@
         <w:pStyle w:val="ListBullet"/>
       </w:pPr>
       <w:r>
-        <w:t>A Chapter 5 contact has an id, a name, an email, and a phone, and nothing else. Lessons 4.11 to 4.14 and the Chapter 4 project also put contacts in groups; Chapter 5 does not use groups, so its contacts table has no group_id column and there is no contact_groups table. The Data Reset drops the group table that Chapter 4 left behind.</w:t>
+        <w:t>A Chapter 5 contact has an id, a name, an email, and a phone, and nothing else. Lessons 4.11 to 4.14 and the Chapter 4 project also put contacts in groups; Chapter 5 does not use groups, so its contacts table has no group_id column and there is no group table. The Data Reset drops the group tables, such as contact_groups_c, that Chapter 4 left behind.</w:t>
       </w:r>
     </w:p>
     <w:p>
@@ -322,6 +322,14 @@
         <w:pStyle w:val="ListBullet"/>
       </w:pPr>
       <w:r>
+        <w:t>Remember, each language keeps its own table (Lesson 4.4): contacts_c for C, then contacts_cpp, contacts_csharp, contacts_go, contacts_python, and contacts_typescript, each reset by its own file, such as sql/reset_contacts_c.sql. The programs print the same lines in every language; only the table's name in their SQL differs.</w:t>
+      </w:r>
+    </w:p>
+    <w:p>
+      <w:pPr>
+        <w:pStyle w:val="ListBullet"/>
+      </w:pPr>
+      <w:r>
         <w:t>Only the email is UNIQUE. Two contacts may share a name, as two real people can: the clean run adds a second Ada Lovelace with her own email.</w:t>
       </w:r>
     </w:p>
@@ -465,7 +473,7 @@
         <w:pStyle w:val="ListBullet"/>
       </w:pPr>
       <w:r>
-        <w:t>After the INSERT, create_contact does not print the values it was given. It asks the database for the row with the new id, SELECT id, name, email, phone FROM contacts WHERE id = ?, and prints that row. The screen then shows what was stored: the trimmed name, the server's id, and (no phone) for the NULL the empty phone became.</w:t>
+        <w:t>After the INSERT, create_contact does not print the values it was given. It asks the database for the row with the new id, SELECT id, name, email, phone FROM contacts_c WHERE id = ?, with its own language's table, and prints that row. The screen then shows what was stored: the trimmed name, the server's id, and (no phone) for the NULL the empty phone became.</w:t>
       </w:r>
     </w:p>
     <w:p>
@@ -926,7 +934,7 @@
         <w:pStyle w:val="ListBullet"/>
       </w:pPr>
       <w:r>
-        <w:t>Every language prints identical lines for the same input and leaves the same rows in the table.</w:t>
+        <w:t>Every language uses its own table, contacts_c to contacts_typescript, prints identical lines for the same input, and leaves the same rows in its table.</w:t>
       </w:r>
     </w:p>
     <w:p>
@@ -975,7 +983,47 @@
         <w:pStyle w:val="CommandBlock"/>
       </w:pPr>
       <w:r>
-        <w:t xml:space="preserve">  sql/reset_contacts.sql</w:t>
+        <w:t xml:space="preserve">  sql/reset_contacts_c.sql</w:t>
+      </w:r>
+    </w:p>
+    <w:p>
+      <w:pPr>
+        <w:pStyle w:val="CommandBlock"/>
+      </w:pPr>
+      <w:r>
+        <w:t xml:space="preserve">  sql/reset_contacts_cpp.sql</w:t>
+      </w:r>
+    </w:p>
+    <w:p>
+      <w:pPr>
+        <w:pStyle w:val="CommandBlock"/>
+      </w:pPr>
+      <w:r>
+        <w:t xml:space="preserve">  sql/reset_contacts_csharp.sql</w:t>
+      </w:r>
+    </w:p>
+    <w:p>
+      <w:pPr>
+        <w:pStyle w:val="CommandBlock"/>
+      </w:pPr>
+      <w:r>
+        <w:t xml:space="preserve">  sql/reset_contacts_go.sql</w:t>
+      </w:r>
+    </w:p>
+    <w:p>
+      <w:pPr>
+        <w:pStyle w:val="CommandBlock"/>
+      </w:pPr>
+      <w:r>
+        <w:t xml:space="preserve">  sql/reset_contacts_python.sql</w:t>
+      </w:r>
+    </w:p>
+    <w:p>
+      <w:pPr>
+        <w:pStyle w:val="CommandBlock"/>
+      </w:pPr>
+      <w:r>
+        <w:t xml:space="preserve">  sql/reset_contacts_typescript.sql</w:t>
       </w:r>
     </w:p>
     <w:p>
@@ -2321,10 +2369,10 @@
     </w:p>
     <w:p>
       <w:r>
-        <w:t>Every Chapter 5 lesson starts from the same known state: the contacts table with Lesson 4.6's three contacts. The reset file drops contacts, then contact_groups, which Lessons 4.11 to 4.14 left behind and Chapter 5 does not use, creates Chapter 5's contacts table, and inserts the three contacts. It removes any rows earlier lessons or your own experiments left in spa_contacts; those were practice rows, and the Chapter 5 Project keeps its own database. Both Build and Run blocks of every language run this file</w:t>
-      </w:r>
-      <w:r>
-        <w:t xml:space="preserve"> again, so each run starts from exactly this state.</w:t>
+        <w:t>Every Chapter 5 lesson starts from the same known state: each language's contacts table with Lesson 4.6's three contacts. Remember, each language keeps its own table, with its own reset file: reset_contacts_c.sql resets contacts_c, and running it never changes another language's rows. The six files differ only in the language's name. Each file drops its contacts table, then its group table, such as contact_groups_c, which Lessons 4.11 to 4.14 left behind and Chapter 5 does not use, creates Chapter 5's conta</w:t>
+      </w:r>
+      <w:r>
+        <w:t>cts table, and inserts the three contacts. It removes any rows earlier lessons or your own experiments left in the table; those were practice rows, and the Chapter 5 Project keeps its own database. Both Build and Run blocks of every language run that language's file again, so each run starts from exactly this state.</w:t>
       </w:r>
     </w:p>
     <w:p>
@@ -2347,46 +2395,54 @@
         <w:pStyle w:val="Heading3"/>
       </w:pPr>
       <w:r>
-        <w:t>sql/reset_contacts.sql</w:t>
-      </w:r>
-    </w:p>
-    <w:p>
-      <w:pPr>
-        <w:pStyle w:val="SourceCode"/>
-        <w:keepNext/>
-      </w:pPr>
-      <w:r>
-        <w:t>-- Chapter 5's known state. This file resets the lesson table: it drops</w:t>
-      </w:r>
-    </w:p>
-    <w:p>
-      <w:pPr>
-        <w:pStyle w:val="SourceCode"/>
-        <w:keepNext/>
-      </w:pPr>
-      <w:r>
-        <w:t>-- it, with any rows earlier lessons or your own experiments left in it,</w:t>
-      </w:r>
-    </w:p>
-    <w:p>
-      <w:pPr>
-        <w:pStyle w:val="SourceCode"/>
-      </w:pPr>
-      <w:r>
-        <w:t>-- and builds it again with Lesson 4.6's three contacts.</w:t>
-      </w:r>
-    </w:p>
-    <w:p>
-      <w:pPr>
-        <w:pStyle w:val="SourceCode"/>
-      </w:pPr>
-    </w:p>
-    <w:p>
-      <w:pPr>
-        <w:pStyle w:val="SourceCode"/>
-      </w:pPr>
-      <w:r>
-        <w:t>-- Remove the old tables and every row in them (Lesson 4.4). contacts goes</w:t>
+        <w:t>sql/reset_contacts_c.sql</w:t>
+      </w:r>
+    </w:p>
+    <w:p>
+      <w:pPr>
+        <w:pStyle w:val="SourceCode"/>
+        <w:keepNext/>
+      </w:pPr>
+      <w:r>
+        <w:t>-- Chapter 5's known state for C. This file resets the C programs' own</w:t>
+      </w:r>
+    </w:p>
+    <w:p>
+      <w:pPr>
+        <w:pStyle w:val="SourceCode"/>
+        <w:keepNext/>
+      </w:pPr>
+      <w:r>
+        <w:t>-- table, contacts_c: it drops it, with any rows earlier lessons or your own</w:t>
+      </w:r>
+    </w:p>
+    <w:p>
+      <w:pPr>
+        <w:pStyle w:val="SourceCode"/>
+      </w:pPr>
+      <w:r>
+        <w:t>-- experiments left in it, and builds it again with Lesson 4.6's three</w:t>
+      </w:r>
+    </w:p>
+    <w:p>
+      <w:pPr>
+        <w:pStyle w:val="SourceCode"/>
+      </w:pPr>
+      <w:r>
+        <w:t>-- contacts. Every other language has its own file and its own table.</w:t>
+      </w:r>
+    </w:p>
+    <w:p>
+      <w:pPr>
+        <w:pStyle w:val="SourceCode"/>
+      </w:pPr>
+    </w:p>
+    <w:p>
+      <w:pPr>
+        <w:pStyle w:val="SourceCode"/>
+      </w:pPr>
+      <w:r>
+        <w:t>-- Remove the old tables and every row in them (Lesson 4.4). contacts_c goes</w:t>
       </w:r>
     </w:p>
     <w:p>
@@ -2402,7 +2458,7 @@
         <w:pStyle w:val="SourceCode"/>
       </w:pPr>
       <w:r>
-        <w:t>-- contact_groups, and the server refuses to drop a table that another</w:t>
+        <w:t>-- contact_groups_c, and the server refuses to drop a table that another</w:t>
       </w:r>
     </w:p>
     <w:p>
@@ -2418,7 +2474,7 @@
         <w:pStyle w:val="SourceCode"/>
       </w:pPr>
       <w:r>
-        <w:t>-- contact_groups is dropped and not created again. IF EXISTS skips a</w:t>
+        <w:t>-- contact_groups_c is dropped and not created again. IF EXISTS skips a</w:t>
       </w:r>
     </w:p>
     <w:p>
@@ -2434,15 +2490,15 @@
         <w:pStyle w:val="SourceCode"/>
       </w:pPr>
       <w:r>
-        <w:t>DROP TABLE IF EXISTS contacts;</w:t>
-      </w:r>
-    </w:p>
-    <w:p>
-      <w:pPr>
-        <w:pStyle w:val="SourceCode"/>
-      </w:pPr>
-      <w:r>
-        <w:t>DROP TABLE IF EXISTS contact_groups;</w:t>
+        <w:t>DROP TABLE IF EXISTS contacts_c;</w:t>
+      </w:r>
+    </w:p>
+    <w:p>
+      <w:pPr>
+        <w:pStyle w:val="SourceCode"/>
+      </w:pPr>
+      <w:r>
+        <w:t>DROP TABLE IF EXISTS contact_groups_c;</w:t>
       </w:r>
     </w:p>
     <w:p>
@@ -2479,7 +2535,7 @@
         <w:pStyle w:val="SourceCode"/>
       </w:pPr>
       <w:r>
-        <w:t>CREATE TABLE contacts (</w:t>
+        <w:t>CREATE TABLE contacts_c (</w:t>
       </w:r>
     </w:p>
     <w:p>
@@ -2519,7 +2575,7 @@
         <w:pStyle w:val="SourceCode"/>
       </w:pPr>
       <w:r>
-        <w:t xml:space="preserve">    INDEX idx_contacts_name (name)</w:t>
+        <w:t xml:space="preserve">    INDEX idx_contacts_c_name (name)</w:t>
       </w:r>
     </w:p>
     <w:p>
@@ -2548,7 +2604,7 @@
         <w:pStyle w:val="SourceCode"/>
       </w:pPr>
       <w:r>
-        <w:t>INSERT INTO contacts (name, email, phone)</w:t>
+        <w:t>INSERT INTO contacts_c (name, email, phone)</w:t>
       </w:r>
     </w:p>
     <w:p>
@@ -2564,7 +2620,7 @@
         <w:pStyle w:val="SourceCode"/>
       </w:pPr>
       <w:r>
-        <w:t>INSERT INTO contacts (name, email, phone)</w:t>
+        <w:t>INSERT INTO contacts_c (name, email, phone)</w:t>
       </w:r>
     </w:p>
     <w:p>
@@ -2582,7 +2638,7 @@
         <w:keepNext/>
       </w:pPr>
       <w:r>
-        <w:t>INSERT INTO contacts (name, email, phone)</w:t>
+        <w:t>INSERT INTO contacts_c (name, email, phone)</w:t>
       </w:r>
     </w:p>
     <w:p>
@@ -2599,23 +2655,1351 @@
       </w:pPr>
     </w:p>
     <w:p>
-      <w:r>
-        <w:t>The first client command is Lesson 4.2's CREATE DATABASE IF NOT EXISTS spa_contacts, so this lesson works even if you start here. The second runs the file. Remember, source is the mysql client's own command, and it runs every statement in a file, in order, printing nothing when they succeed; the client runs its own commands from -e only when --commands is given (Lesson 4.6). On Linux or macOS, &lt; sends the file to the client's input instead, which does the same. The third shows the table. Remember, MYSQL_PWD</w:t>
-      </w:r>
-      <w:r>
-        <w:t xml:space="preserve"> lasts only until the block's last line, -D names the database, and -t prints the answer as a table.</w:t>
-      </w:r>
-    </w:p>
-    <w:p>
-      <w:pPr>
-        <w:keepNext/>
-      </w:pPr>
-    </w:p>
-    <w:p>
       <w:pPr>
         <w:pStyle w:val="Heading3"/>
       </w:pPr>
       <w:r>
+        <w:t>sql/reset_contacts_cpp.sql</w:t>
+      </w:r>
+    </w:p>
+    <w:p>
+      <w:pPr>
+        <w:pStyle w:val="SourceCode"/>
+        <w:keepNext/>
+      </w:pPr>
+      <w:r>
+        <w:t>-- Chapter 5's known state for C++. This file resets the C++ programs' own</w:t>
+      </w:r>
+    </w:p>
+    <w:p>
+      <w:pPr>
+        <w:pStyle w:val="SourceCode"/>
+        <w:keepNext/>
+      </w:pPr>
+      <w:r>
+        <w:t>-- table, contacts_cpp: it drops it, with any rows earlier lessons or your</w:t>
+      </w:r>
+    </w:p>
+    <w:p>
+      <w:pPr>
+        <w:pStyle w:val="SourceCode"/>
+      </w:pPr>
+      <w:r>
+        <w:t>-- own experiments left in it, and builds it again with Lesson 4.6's three</w:t>
+      </w:r>
+    </w:p>
+    <w:p>
+      <w:pPr>
+        <w:pStyle w:val="SourceCode"/>
+      </w:pPr>
+      <w:r>
+        <w:t>-- contacts. Every other language has its own file and its own table.</w:t>
+      </w:r>
+    </w:p>
+    <w:p>
+      <w:pPr>
+        <w:pStyle w:val="SourceCode"/>
+      </w:pPr>
+    </w:p>
+    <w:p>
+      <w:pPr>
+        <w:pStyle w:val="SourceCode"/>
+      </w:pPr>
+      <w:r>
+        <w:t>-- Remove the old tables and every row in them (Lesson 4.4). contacts_cpp</w:t>
+      </w:r>
+    </w:p>
+    <w:p>
+      <w:pPr>
+        <w:pStyle w:val="SourceCode"/>
+      </w:pPr>
+      <w:r>
+        <w:t>-- goes first, because in Lessons 4.11 to 4.14 its rows pointed at</w:t>
+      </w:r>
+    </w:p>
+    <w:p>
+      <w:pPr>
+        <w:pStyle w:val="SourceCode"/>
+      </w:pPr>
+      <w:r>
+        <w:t>-- contact_groups_cpp, and the server refuses to drop a table that another</w:t>
+      </w:r>
+    </w:p>
+    <w:p>
+      <w:pPr>
+        <w:pStyle w:val="SourceCode"/>
+      </w:pPr>
+      <w:r>
+        <w:t>-- table's foreign key still points at. Chapter 5 has no groups, so</w:t>
+      </w:r>
+    </w:p>
+    <w:p>
+      <w:pPr>
+        <w:pStyle w:val="SourceCode"/>
+      </w:pPr>
+      <w:r>
+        <w:t>-- contact_groups_cpp is dropped and not created again. IF EXISTS skips a</w:t>
+      </w:r>
+    </w:p>
+    <w:p>
+      <w:pPr>
+        <w:pStyle w:val="SourceCode"/>
+      </w:pPr>
+      <w:r>
+        <w:t>-- table that is not there.</w:t>
+      </w:r>
+    </w:p>
+    <w:p>
+      <w:pPr>
+        <w:pStyle w:val="SourceCode"/>
+      </w:pPr>
+      <w:r>
+        <w:t>DROP TABLE IF EXISTS contacts_cpp;</w:t>
+      </w:r>
+    </w:p>
+    <w:p>
+      <w:pPr>
+        <w:pStyle w:val="SourceCode"/>
+      </w:pPr>
+      <w:r>
+        <w:t>DROP TABLE IF EXISTS contact_groups_cpp;</w:t>
+      </w:r>
+    </w:p>
+    <w:p>
+      <w:pPr>
+        <w:pStyle w:val="SourceCode"/>
+      </w:pPr>
+    </w:p>
+    <w:p>
+      <w:pPr>
+        <w:pStyle w:val="SourceCode"/>
+      </w:pPr>
+      <w:r>
+        <w:t>-- Lesson 4.4's contacts table, with Lesson 4.12's index on name written</w:t>
+      </w:r>
+    </w:p>
+    <w:p>
+      <w:pPr>
+        <w:pStyle w:val="SourceCode"/>
+      </w:pPr>
+      <w:r>
+        <w:t>-- inside CREATE TABLE. Only email is UNIQUE, so two contacts may share a</w:t>
+      </w:r>
+    </w:p>
+    <w:p>
+      <w:pPr>
+        <w:pStyle w:val="SourceCode"/>
+      </w:pPr>
+      <w:r>
+        <w:t>-- name, and phone may be NULL: no phone.</w:t>
+      </w:r>
+    </w:p>
+    <w:p>
+      <w:pPr>
+        <w:pStyle w:val="SourceCode"/>
+      </w:pPr>
+      <w:r>
+        <w:t>CREATE TABLE contacts_cpp (</w:t>
+      </w:r>
+    </w:p>
+    <w:p>
+      <w:pPr>
+        <w:pStyle w:val="SourceCode"/>
+      </w:pPr>
+      <w:r>
+        <w:t xml:space="preserve">    id    INT AUTO_INCREMENT PRIMARY KEY,</w:t>
+      </w:r>
+    </w:p>
+    <w:p>
+      <w:pPr>
+        <w:pStyle w:val="SourceCode"/>
+      </w:pPr>
+      <w:r>
+        <w:t xml:space="preserve">    name  VARCHAR(100) NOT NULL,</w:t>
+      </w:r>
+    </w:p>
+    <w:p>
+      <w:pPr>
+        <w:pStyle w:val="SourceCode"/>
+      </w:pPr>
+      <w:r>
+        <w:t xml:space="preserve">    email VARCHAR(254) NOT NULL UNIQUE,</w:t>
+      </w:r>
+    </w:p>
+    <w:p>
+      <w:pPr>
+        <w:pStyle w:val="SourceCode"/>
+      </w:pPr>
+      <w:r>
+        <w:t xml:space="preserve">    phone VARCHAR(20)  NULL,</w:t>
+      </w:r>
+    </w:p>
+    <w:p>
+      <w:pPr>
+        <w:pStyle w:val="SourceCode"/>
+      </w:pPr>
+      <w:r>
+        <w:t xml:space="preserve">    INDEX idx_contacts_cpp_name (name)</w:t>
+      </w:r>
+    </w:p>
+    <w:p>
+      <w:pPr>
+        <w:pStyle w:val="SourceCode"/>
+      </w:pPr>
+      <w:r>
+        <w:t>) CHARACTER SET utf8mb4;</w:t>
+      </w:r>
+    </w:p>
+    <w:p>
+      <w:pPr>
+        <w:pStyle w:val="SourceCode"/>
+      </w:pPr>
+    </w:p>
+    <w:p>
+      <w:pPr>
+        <w:pStyle w:val="SourceCode"/>
+      </w:pPr>
+      <w:r>
+        <w:t>-- Lesson 4.6's three contacts, ids 1, 2, 3. Grace Hopper has no phone.</w:t>
+      </w:r>
+    </w:p>
+    <w:p>
+      <w:pPr>
+        <w:pStyle w:val="SourceCode"/>
+      </w:pPr>
+      <w:r>
+        <w:t>INSERT INTO contacts_cpp (name, email, phone)</w:t>
+      </w:r>
+    </w:p>
+    <w:p>
+      <w:pPr>
+        <w:pStyle w:val="SourceCode"/>
+      </w:pPr>
+      <w:r>
+        <w:t xml:space="preserve">    VALUES ('Ada Lovelace', 'ada@example.com', '555-0100');</w:t>
+      </w:r>
+    </w:p>
+    <w:p>
+      <w:pPr>
+        <w:pStyle w:val="SourceCode"/>
+      </w:pPr>
+      <w:r>
+        <w:t>INSERT INTO contacts_cpp (name, email, phone)</w:t>
+      </w:r>
+    </w:p>
+    <w:p>
+      <w:pPr>
+        <w:pStyle w:val="SourceCode"/>
+        <w:keepNext/>
+      </w:pPr>
+      <w:r>
+        <w:t xml:space="preserve">    VALUES ('Grace Hopper', 'grace@example.com', NULL);</w:t>
+      </w:r>
+    </w:p>
+    <w:p>
+      <w:pPr>
+        <w:pStyle w:val="SourceCode"/>
+        <w:keepNext/>
+      </w:pPr>
+      <w:r>
+        <w:t>INSERT INTO contacts_cpp (name, email, phone)</w:t>
+      </w:r>
+    </w:p>
+    <w:p>
+      <w:pPr>
+        <w:pStyle w:val="SourceCode"/>
+      </w:pPr>
+      <w:r>
+        <w:t xml:space="preserve">    VALUES ('Alan Turing', 'alan@example.com', '555-0102');</w:t>
+      </w:r>
+    </w:p>
+    <w:p>
+      <w:pPr>
+        <w:keepNext/>
+      </w:pPr>
+    </w:p>
+    <w:p>
+      <w:pPr>
+        <w:pStyle w:val="Heading3"/>
+      </w:pPr>
+      <w:r>
+        <w:t>sql/reset_contacts_csharp.sql</w:t>
+      </w:r>
+    </w:p>
+    <w:p>
+      <w:pPr>
+        <w:pStyle w:val="SourceCode"/>
+        <w:keepNext/>
+      </w:pPr>
+      <w:r>
+        <w:t>-- Chapter 5's known state for C#. This file resets the C# programs' own</w:t>
+      </w:r>
+    </w:p>
+    <w:p>
+      <w:pPr>
+        <w:pStyle w:val="SourceCode"/>
+        <w:keepNext/>
+      </w:pPr>
+      <w:r>
+        <w:t>-- table, contacts_csharp: it drops it, with any rows earlier lessons or</w:t>
+      </w:r>
+    </w:p>
+    <w:p>
+      <w:pPr>
+        <w:pStyle w:val="SourceCode"/>
+      </w:pPr>
+      <w:r>
+        <w:t>-- your own experiments left in it, and builds it again with Lesson 4.6's</w:t>
+      </w:r>
+    </w:p>
+    <w:p>
+      <w:pPr>
+        <w:pStyle w:val="SourceCode"/>
+      </w:pPr>
+      <w:r>
+        <w:t>-- three contacts. Every other language has its own file and its own table.</w:t>
+      </w:r>
+    </w:p>
+    <w:p>
+      <w:pPr>
+        <w:pStyle w:val="SourceCode"/>
+      </w:pPr>
+    </w:p>
+    <w:p>
+      <w:pPr>
+        <w:pStyle w:val="SourceCode"/>
+      </w:pPr>
+      <w:r>
+        <w:t>-- Remove the old tables and every row in them (Lesson 4.4). contacts_csharp</w:t>
+      </w:r>
+    </w:p>
+    <w:p>
+      <w:pPr>
+        <w:pStyle w:val="SourceCode"/>
+      </w:pPr>
+      <w:r>
+        <w:t>-- goes first, because in Lessons 4.11 to 4.14 its rows pointed at</w:t>
+      </w:r>
+    </w:p>
+    <w:p>
+      <w:pPr>
+        <w:pStyle w:val="SourceCode"/>
+      </w:pPr>
+      <w:r>
+        <w:t>-- contact_groups_csharp, and the server refuses to drop a table that</w:t>
+      </w:r>
+    </w:p>
+    <w:p>
+      <w:pPr>
+        <w:pStyle w:val="SourceCode"/>
+      </w:pPr>
+      <w:r>
+        <w:t>-- another table's foreign key still points at. Chapter 5 has no groups, so</w:t>
+      </w:r>
+    </w:p>
+    <w:p>
+      <w:pPr>
+        <w:pStyle w:val="SourceCode"/>
+      </w:pPr>
+      <w:r>
+        <w:t>-- contact_groups_csharp is dropped and not created again. IF EXISTS skips a</w:t>
+      </w:r>
+    </w:p>
+    <w:p>
+      <w:pPr>
+        <w:pStyle w:val="SourceCode"/>
+      </w:pPr>
+      <w:r>
+        <w:t>-- table that is not there.</w:t>
+      </w:r>
+    </w:p>
+    <w:p>
+      <w:pPr>
+        <w:pStyle w:val="SourceCode"/>
+      </w:pPr>
+      <w:r>
+        <w:t>DROP TABLE IF EXISTS contacts_csharp;</w:t>
+      </w:r>
+    </w:p>
+    <w:p>
+      <w:pPr>
+        <w:pStyle w:val="SourceCode"/>
+      </w:pPr>
+      <w:r>
+        <w:t>DROP TABLE IF EXISTS contact_groups_csharp;</w:t>
+      </w:r>
+    </w:p>
+    <w:p>
+      <w:pPr>
+        <w:pStyle w:val="SourceCode"/>
+      </w:pPr>
+    </w:p>
+    <w:p>
+      <w:pPr>
+        <w:pStyle w:val="SourceCode"/>
+      </w:pPr>
+      <w:r>
+        <w:t>-- Lesson 4.4's contacts table, with Lesson 4.12's index on name written</w:t>
+      </w:r>
+    </w:p>
+    <w:p>
+      <w:pPr>
+        <w:pStyle w:val="SourceCode"/>
+      </w:pPr>
+      <w:r>
+        <w:t>-- inside CREATE TABLE. Only email is UNIQUE, so two contacts may share a</w:t>
+      </w:r>
+    </w:p>
+    <w:p>
+      <w:pPr>
+        <w:pStyle w:val="SourceCode"/>
+      </w:pPr>
+      <w:r>
+        <w:t>-- name, and phone may be NULL: no phone.</w:t>
+      </w:r>
+    </w:p>
+    <w:p>
+      <w:pPr>
+        <w:pStyle w:val="SourceCode"/>
+      </w:pPr>
+      <w:r>
+        <w:t>CREATE TABLE contacts_csharp (</w:t>
+      </w:r>
+    </w:p>
+    <w:p>
+      <w:pPr>
+        <w:pStyle w:val="SourceCode"/>
+      </w:pPr>
+      <w:r>
+        <w:t xml:space="preserve">    id    INT AUTO_INCREMENT PRIMARY KEY,</w:t>
+      </w:r>
+    </w:p>
+    <w:p>
+      <w:pPr>
+        <w:pStyle w:val="SourceCode"/>
+      </w:pPr>
+      <w:r>
+        <w:t xml:space="preserve">    name  VARCHAR(100) NOT NULL,</w:t>
+      </w:r>
+    </w:p>
+    <w:p>
+      <w:pPr>
+        <w:pStyle w:val="SourceCode"/>
+      </w:pPr>
+      <w:r>
+        <w:t xml:space="preserve">    email VARCHAR(254) NOT NULL UNIQUE,</w:t>
+      </w:r>
+    </w:p>
+    <w:p>
+      <w:pPr>
+        <w:pStyle w:val="SourceCode"/>
+      </w:pPr>
+      <w:r>
+        <w:t xml:space="preserve">    phone VARCHAR(20)  NULL,</w:t>
+      </w:r>
+    </w:p>
+    <w:p>
+      <w:pPr>
+        <w:pStyle w:val="SourceCode"/>
+      </w:pPr>
+      <w:r>
+        <w:t xml:space="preserve">    INDEX idx_contacts_csharp_name (name)</w:t>
+      </w:r>
+    </w:p>
+    <w:p>
+      <w:pPr>
+        <w:pStyle w:val="SourceCode"/>
+      </w:pPr>
+      <w:r>
+        <w:t>) CHARACTER SET utf8mb4;</w:t>
+      </w:r>
+    </w:p>
+    <w:p>
+      <w:pPr>
+        <w:pStyle w:val="SourceCode"/>
+      </w:pPr>
+    </w:p>
+    <w:p>
+      <w:pPr>
+        <w:pStyle w:val="SourceCode"/>
+      </w:pPr>
+      <w:r>
+        <w:t>-- Lesson 4.6's three contacts, ids 1, 2, 3. Grace Hopper has no phone.</w:t>
+      </w:r>
+    </w:p>
+    <w:p>
+      <w:pPr>
+        <w:pStyle w:val="SourceCode"/>
+      </w:pPr>
+      <w:r>
+        <w:t>INSERT INTO contacts_csharp (name, email, phone)</w:t>
+      </w:r>
+    </w:p>
+    <w:p>
+      <w:pPr>
+        <w:pStyle w:val="SourceCode"/>
+      </w:pPr>
+      <w:r>
+        <w:t xml:space="preserve">    VALUES ('Ada Lovelace', 'ada@example.com', '555-0100');</w:t>
+      </w:r>
+    </w:p>
+    <w:p>
+      <w:pPr>
+        <w:pStyle w:val="SourceCode"/>
+      </w:pPr>
+      <w:r>
+        <w:t>INSERT INTO contacts_csharp (name, email, phone)</w:t>
+      </w:r>
+    </w:p>
+    <w:p>
+      <w:pPr>
+        <w:pStyle w:val="SourceCode"/>
+        <w:keepNext/>
+      </w:pPr>
+      <w:r>
+        <w:t xml:space="preserve">    VALUES ('Grace Hopper', 'grace@example.com', NULL);</w:t>
+      </w:r>
+    </w:p>
+    <w:p>
+      <w:pPr>
+        <w:pStyle w:val="SourceCode"/>
+        <w:keepNext/>
+      </w:pPr>
+      <w:r>
+        <w:t>INSERT INTO contacts_csharp (name, email, phone)</w:t>
+      </w:r>
+    </w:p>
+    <w:p>
+      <w:pPr>
+        <w:pStyle w:val="SourceCode"/>
+      </w:pPr>
+      <w:r>
+        <w:t xml:space="preserve">    VALUES ('Alan Turing', 'alan@example.com', '555-0102');</w:t>
+      </w:r>
+    </w:p>
+    <w:p>
+      <w:pPr>
+        <w:keepNext/>
+      </w:pPr>
+    </w:p>
+    <w:p>
+      <w:pPr>
+        <w:pStyle w:val="Heading3"/>
+      </w:pPr>
+      <w:r>
+        <w:t>sql/reset_contacts_go.sql</w:t>
+      </w:r>
+    </w:p>
+    <w:p>
+      <w:pPr>
+        <w:pStyle w:val="SourceCode"/>
+        <w:keepNext/>
+      </w:pPr>
+      <w:r>
+        <w:t>-- Chapter 5's known state for Go. This file resets the Go programs' own</w:t>
+      </w:r>
+    </w:p>
+    <w:p>
+      <w:pPr>
+        <w:pStyle w:val="SourceCode"/>
+        <w:keepNext/>
+      </w:pPr>
+      <w:r>
+        <w:t>-- table, contacts_go: it drops it, with any rows earlier lessons or your</w:t>
+      </w:r>
+    </w:p>
+    <w:p>
+      <w:pPr>
+        <w:pStyle w:val="SourceCode"/>
+      </w:pPr>
+      <w:r>
+        <w:t>-- own experiments left in it, and builds it again with Lesson 4.6's three</w:t>
+      </w:r>
+    </w:p>
+    <w:p>
+      <w:pPr>
+        <w:pStyle w:val="SourceCode"/>
+      </w:pPr>
+      <w:r>
+        <w:t>-- contacts. Every other language has its own file and its own table.</w:t>
+      </w:r>
+    </w:p>
+    <w:p>
+      <w:pPr>
+        <w:pStyle w:val="SourceCode"/>
+      </w:pPr>
+    </w:p>
+    <w:p>
+      <w:pPr>
+        <w:pStyle w:val="SourceCode"/>
+      </w:pPr>
+      <w:r>
+        <w:t>-- Remove the old tables and every row in them (Lesson 4.4). contacts_go</w:t>
+      </w:r>
+    </w:p>
+    <w:p>
+      <w:pPr>
+        <w:pStyle w:val="SourceCode"/>
+      </w:pPr>
+      <w:r>
+        <w:t>-- goes first, because in Lessons 4.11 to 4.14 its rows pointed at</w:t>
+      </w:r>
+    </w:p>
+    <w:p>
+      <w:pPr>
+        <w:pStyle w:val="SourceCode"/>
+      </w:pPr>
+      <w:r>
+        <w:t>-- contact_groups_go, and the server refuses to drop a table that another</w:t>
+      </w:r>
+    </w:p>
+    <w:p>
+      <w:pPr>
+        <w:pStyle w:val="SourceCode"/>
+      </w:pPr>
+      <w:r>
+        <w:t>-- table's foreign key still points at. Chapter 5 has no groups, so</w:t>
+      </w:r>
+    </w:p>
+    <w:p>
+      <w:pPr>
+        <w:pStyle w:val="SourceCode"/>
+      </w:pPr>
+      <w:r>
+        <w:t>-- contact_groups_go is dropped and not created again. IF EXISTS skips a</w:t>
+      </w:r>
+    </w:p>
+    <w:p>
+      <w:pPr>
+        <w:pStyle w:val="SourceCode"/>
+      </w:pPr>
+      <w:r>
+        <w:t>-- table that is not there.</w:t>
+      </w:r>
+    </w:p>
+    <w:p>
+      <w:pPr>
+        <w:pStyle w:val="SourceCode"/>
+      </w:pPr>
+      <w:r>
+        <w:t>DROP TABLE IF EXISTS contacts_go;</w:t>
+      </w:r>
+    </w:p>
+    <w:p>
+      <w:pPr>
+        <w:pStyle w:val="SourceCode"/>
+      </w:pPr>
+      <w:r>
+        <w:t>DROP TABLE IF EXISTS contact_groups_go;</w:t>
+      </w:r>
+    </w:p>
+    <w:p>
+      <w:pPr>
+        <w:pStyle w:val="SourceCode"/>
+      </w:pPr>
+    </w:p>
+    <w:p>
+      <w:pPr>
+        <w:pStyle w:val="SourceCode"/>
+      </w:pPr>
+      <w:r>
+        <w:t>-- Lesson 4.4's contacts table, with Lesson 4.12's index on name written</w:t>
+      </w:r>
+    </w:p>
+    <w:p>
+      <w:pPr>
+        <w:pStyle w:val="SourceCode"/>
+      </w:pPr>
+      <w:r>
+        <w:t>-- inside CREATE TABLE. Only email is UNIQUE, so two contacts may share a</w:t>
+      </w:r>
+    </w:p>
+    <w:p>
+      <w:pPr>
+        <w:pStyle w:val="SourceCode"/>
+      </w:pPr>
+      <w:r>
+        <w:t>-- name, and phone may be NULL: no phone.</w:t>
+      </w:r>
+    </w:p>
+    <w:p>
+      <w:pPr>
+        <w:pStyle w:val="SourceCode"/>
+      </w:pPr>
+      <w:r>
+        <w:t>CREATE TABLE contacts_go (</w:t>
+      </w:r>
+    </w:p>
+    <w:p>
+      <w:pPr>
+        <w:pStyle w:val="SourceCode"/>
+      </w:pPr>
+      <w:r>
+        <w:t xml:space="preserve">    id    INT AUTO_INCREMENT PRIMARY KEY,</w:t>
+      </w:r>
+    </w:p>
+    <w:p>
+      <w:pPr>
+        <w:pStyle w:val="SourceCode"/>
+      </w:pPr>
+      <w:r>
+        <w:t xml:space="preserve">    name  VARCHAR(100) NOT NULL,</w:t>
+      </w:r>
+    </w:p>
+    <w:p>
+      <w:pPr>
+        <w:pStyle w:val="SourceCode"/>
+      </w:pPr>
+      <w:r>
+        <w:t xml:space="preserve">    email VARCHAR(254) NOT NULL UNIQUE,</w:t>
+      </w:r>
+    </w:p>
+    <w:p>
+      <w:pPr>
+        <w:pStyle w:val="SourceCode"/>
+      </w:pPr>
+      <w:r>
+        <w:t xml:space="preserve">    phone VARCHAR(20)  NULL,</w:t>
+      </w:r>
+    </w:p>
+    <w:p>
+      <w:pPr>
+        <w:pStyle w:val="SourceCode"/>
+      </w:pPr>
+      <w:r>
+        <w:t xml:space="preserve">    INDEX idx_contacts_go_name (name)</w:t>
+      </w:r>
+    </w:p>
+    <w:p>
+      <w:pPr>
+        <w:pStyle w:val="SourceCode"/>
+      </w:pPr>
+      <w:r>
+        <w:t>) CHARACTER SET utf8mb4;</w:t>
+      </w:r>
+    </w:p>
+    <w:p>
+      <w:pPr>
+        <w:pStyle w:val="SourceCode"/>
+      </w:pPr>
+    </w:p>
+    <w:p>
+      <w:pPr>
+        <w:pStyle w:val="SourceCode"/>
+      </w:pPr>
+      <w:r>
+        <w:t>-- Lesson 4.6's three contacts, ids 1, 2, 3. Grace Hopper has no phone.</w:t>
+      </w:r>
+    </w:p>
+    <w:p>
+      <w:pPr>
+        <w:pStyle w:val="SourceCode"/>
+      </w:pPr>
+      <w:r>
+        <w:t>INSERT INTO contacts_go (name, email, phone)</w:t>
+      </w:r>
+    </w:p>
+    <w:p>
+      <w:pPr>
+        <w:pStyle w:val="SourceCode"/>
+      </w:pPr>
+      <w:r>
+        <w:t xml:space="preserve">    VALUES ('Ada Lovelace', 'ada@example.com', '555-0100');</w:t>
+      </w:r>
+    </w:p>
+    <w:p>
+      <w:pPr>
+        <w:pStyle w:val="SourceCode"/>
+      </w:pPr>
+      <w:r>
+        <w:t>INSERT INTO contacts_go (name, email, phone)</w:t>
+      </w:r>
+    </w:p>
+    <w:p>
+      <w:pPr>
+        <w:pStyle w:val="SourceCode"/>
+        <w:keepNext/>
+      </w:pPr>
+      <w:r>
+        <w:t xml:space="preserve">    VALUES ('Grace Hopper', 'grace@example.com', NULL);</w:t>
+      </w:r>
+    </w:p>
+    <w:p>
+      <w:pPr>
+        <w:pStyle w:val="SourceCode"/>
+        <w:keepNext/>
+      </w:pPr>
+      <w:r>
+        <w:t>INSERT INTO contacts_go (name, email, phone)</w:t>
+      </w:r>
+    </w:p>
+    <w:p>
+      <w:pPr>
+        <w:pStyle w:val="SourceCode"/>
+      </w:pPr>
+      <w:r>
+        <w:t xml:space="preserve">    VALUES ('Alan Turing', 'alan@example.com', '555-0102');</w:t>
+      </w:r>
+    </w:p>
+    <w:p>
+      <w:pPr>
+        <w:keepNext/>
+      </w:pPr>
+    </w:p>
+    <w:p>
+      <w:pPr>
+        <w:pStyle w:val="Heading3"/>
+      </w:pPr>
+      <w:r>
+        <w:t>sql/reset_contacts_python.sql</w:t>
+      </w:r>
+    </w:p>
+    <w:p>
+      <w:pPr>
+        <w:pStyle w:val="SourceCode"/>
+        <w:keepNext/>
+      </w:pPr>
+      <w:r>
+        <w:t>-- Chapter 5's known state for Python. This file resets the Python programs'</w:t>
+      </w:r>
+    </w:p>
+    <w:p>
+      <w:pPr>
+        <w:pStyle w:val="SourceCode"/>
+        <w:keepNext/>
+      </w:pPr>
+      <w:r>
+        <w:t>-- own table, contacts_python: it drops it, with any rows earlier lessons or</w:t>
+      </w:r>
+    </w:p>
+    <w:p>
+      <w:pPr>
+        <w:pStyle w:val="SourceCode"/>
+      </w:pPr>
+      <w:r>
+        <w:t>-- your own experiments left in it, and builds it again with Lesson 4.6's</w:t>
+      </w:r>
+    </w:p>
+    <w:p>
+      <w:pPr>
+        <w:pStyle w:val="SourceCode"/>
+      </w:pPr>
+      <w:r>
+        <w:t>-- three contacts. Every other language has its own file and its own table.</w:t>
+      </w:r>
+    </w:p>
+    <w:p>
+      <w:pPr>
+        <w:pStyle w:val="SourceCode"/>
+      </w:pPr>
+    </w:p>
+    <w:p>
+      <w:pPr>
+        <w:pStyle w:val="SourceCode"/>
+      </w:pPr>
+      <w:r>
+        <w:t>-- Remove the old tables and every row in them (Lesson 4.4). contacts_python</w:t>
+      </w:r>
+    </w:p>
+    <w:p>
+      <w:pPr>
+        <w:pStyle w:val="SourceCode"/>
+      </w:pPr>
+      <w:r>
+        <w:t>-- goes first, because in Lessons 4.11 to 4.14 its rows pointed at</w:t>
+      </w:r>
+    </w:p>
+    <w:p>
+      <w:pPr>
+        <w:pStyle w:val="SourceCode"/>
+      </w:pPr>
+      <w:r>
+        <w:t>-- contact_groups_python, and the server refuses to drop a table that</w:t>
+      </w:r>
+    </w:p>
+    <w:p>
+      <w:pPr>
+        <w:pStyle w:val="SourceCode"/>
+      </w:pPr>
+      <w:r>
+        <w:t>-- another table's foreign key still points at. Chapter 5 has no groups, so</w:t>
+      </w:r>
+    </w:p>
+    <w:p>
+      <w:pPr>
+        <w:pStyle w:val="SourceCode"/>
+      </w:pPr>
+      <w:r>
+        <w:t>-- contact_groups_python is dropped and not created again. IF EXISTS skips a</w:t>
+      </w:r>
+    </w:p>
+    <w:p>
+      <w:pPr>
+        <w:pStyle w:val="SourceCode"/>
+      </w:pPr>
+      <w:r>
+        <w:t>-- table that is not there.</w:t>
+      </w:r>
+    </w:p>
+    <w:p>
+      <w:pPr>
+        <w:pStyle w:val="SourceCode"/>
+      </w:pPr>
+      <w:r>
+        <w:t>DROP TABLE IF EXISTS contacts_python;</w:t>
+      </w:r>
+    </w:p>
+    <w:p>
+      <w:pPr>
+        <w:pStyle w:val="SourceCode"/>
+      </w:pPr>
+      <w:r>
+        <w:t>DROP TABLE IF EXISTS contact_groups_python;</w:t>
+      </w:r>
+    </w:p>
+    <w:p>
+      <w:pPr>
+        <w:pStyle w:val="SourceCode"/>
+      </w:pPr>
+    </w:p>
+    <w:p>
+      <w:pPr>
+        <w:pStyle w:val="SourceCode"/>
+      </w:pPr>
+      <w:r>
+        <w:t>-- Lesson 4.4's contacts table, with Lesson 4.12's index on name written</w:t>
+      </w:r>
+    </w:p>
+    <w:p>
+      <w:pPr>
+        <w:pStyle w:val="SourceCode"/>
+      </w:pPr>
+      <w:r>
+        <w:t>-- inside CREATE TABLE. Only email is UNIQUE, so two contacts may share a</w:t>
+      </w:r>
+    </w:p>
+    <w:p>
+      <w:pPr>
+        <w:pStyle w:val="SourceCode"/>
+      </w:pPr>
+      <w:r>
+        <w:t>-- name, and phone may be NULL: no phone.</w:t>
+      </w:r>
+    </w:p>
+    <w:p>
+      <w:pPr>
+        <w:pStyle w:val="SourceCode"/>
+      </w:pPr>
+      <w:r>
+        <w:t>CREATE TABLE contacts_python (</w:t>
+      </w:r>
+    </w:p>
+    <w:p>
+      <w:pPr>
+        <w:pStyle w:val="SourceCode"/>
+      </w:pPr>
+      <w:r>
+        <w:t xml:space="preserve">    id    INT AUTO_INCREMENT PRIMARY KEY,</w:t>
+      </w:r>
+    </w:p>
+    <w:p>
+      <w:pPr>
+        <w:pStyle w:val="SourceCode"/>
+      </w:pPr>
+      <w:r>
+        <w:t xml:space="preserve">    name  VARCHAR(100) NOT NULL,</w:t>
+      </w:r>
+    </w:p>
+    <w:p>
+      <w:pPr>
+        <w:pStyle w:val="SourceCode"/>
+      </w:pPr>
+      <w:r>
+        <w:t xml:space="preserve">    email VARCHAR(254) NOT NULL UNIQUE,</w:t>
+      </w:r>
+    </w:p>
+    <w:p>
+      <w:pPr>
+        <w:pStyle w:val="SourceCode"/>
+      </w:pPr>
+      <w:r>
+        <w:t xml:space="preserve">    phone VARCHAR(20)  NULL,</w:t>
+      </w:r>
+    </w:p>
+    <w:p>
+      <w:pPr>
+        <w:pStyle w:val="SourceCode"/>
+      </w:pPr>
+      <w:r>
+        <w:t xml:space="preserve">    INDEX idx_contacts_python_name (name)</w:t>
+      </w:r>
+    </w:p>
+    <w:p>
+      <w:pPr>
+        <w:pStyle w:val="SourceCode"/>
+      </w:pPr>
+      <w:r>
+        <w:t>) CHARACTER SET utf8mb4;</w:t>
+      </w:r>
+    </w:p>
+    <w:p>
+      <w:pPr>
+        <w:pStyle w:val="SourceCode"/>
+      </w:pPr>
+    </w:p>
+    <w:p>
+      <w:pPr>
+        <w:pStyle w:val="SourceCode"/>
+      </w:pPr>
+      <w:r>
+        <w:t>-- Lesson 4.6's three contacts, ids 1, 2, 3. Grace Hopper has no phone.</w:t>
+      </w:r>
+    </w:p>
+    <w:p>
+      <w:pPr>
+        <w:pStyle w:val="SourceCode"/>
+      </w:pPr>
+      <w:r>
+        <w:t>INSERT INTO contacts_python (name, email, phone)</w:t>
+      </w:r>
+    </w:p>
+    <w:p>
+      <w:pPr>
+        <w:pStyle w:val="SourceCode"/>
+      </w:pPr>
+      <w:r>
+        <w:t xml:space="preserve">    VALUES ('Ada Lovelace', 'ada@example.com', '555-0100');</w:t>
+      </w:r>
+    </w:p>
+    <w:p>
+      <w:pPr>
+        <w:pStyle w:val="SourceCode"/>
+      </w:pPr>
+      <w:r>
+        <w:t>INSERT INTO contacts_python (name, email, phone)</w:t>
+      </w:r>
+    </w:p>
+    <w:p>
+      <w:pPr>
+        <w:pStyle w:val="SourceCode"/>
+        <w:keepNext/>
+      </w:pPr>
+      <w:r>
+        <w:t xml:space="preserve">    VALUES ('Grace Hopper', 'grace@example.com', NULL);</w:t>
+      </w:r>
+    </w:p>
+    <w:p>
+      <w:pPr>
+        <w:pStyle w:val="SourceCode"/>
+        <w:keepNext/>
+      </w:pPr>
+      <w:r>
+        <w:t>INSERT INTO contacts_python (name, email, phone)</w:t>
+      </w:r>
+    </w:p>
+    <w:p>
+      <w:pPr>
+        <w:pStyle w:val="SourceCode"/>
+      </w:pPr>
+      <w:r>
+        <w:t xml:space="preserve">    VALUES ('Alan Turing', 'alan@example.com', '555-0102');</w:t>
+      </w:r>
+    </w:p>
+    <w:p>
+      <w:pPr>
+        <w:keepNext/>
+      </w:pPr>
+    </w:p>
+    <w:p>
+      <w:pPr>
+        <w:pStyle w:val="Heading3"/>
+      </w:pPr>
+      <w:r>
+        <w:t>sql/reset_contacts_typescript.sql</w:t>
+      </w:r>
+    </w:p>
+    <w:p>
+      <w:pPr>
+        <w:pStyle w:val="SourceCode"/>
+        <w:keepNext/>
+      </w:pPr>
+      <w:r>
+        <w:t>-- Chapter 5's known state for TypeScript. This file resets the TypeScript</w:t>
+      </w:r>
+    </w:p>
+    <w:p>
+      <w:pPr>
+        <w:pStyle w:val="SourceCode"/>
+        <w:keepNext/>
+      </w:pPr>
+      <w:r>
+        <w:t>-- programs' own table, contacts_typescript: it drops it, with any rows</w:t>
+      </w:r>
+    </w:p>
+    <w:p>
+      <w:pPr>
+        <w:pStyle w:val="SourceCode"/>
+      </w:pPr>
+      <w:r>
+        <w:t>-- earlier lessons or your own experiments left in it, and builds it again</w:t>
+      </w:r>
+    </w:p>
+    <w:p>
+      <w:pPr>
+        <w:pStyle w:val="SourceCode"/>
+      </w:pPr>
+      <w:r>
+        <w:t>-- with Lesson 4.6's three contacts. Every other language has its own file</w:t>
+      </w:r>
+    </w:p>
+    <w:p>
+      <w:pPr>
+        <w:pStyle w:val="SourceCode"/>
+      </w:pPr>
+      <w:r>
+        <w:t>-- and its own table.</w:t>
+      </w:r>
+    </w:p>
+    <w:p>
+      <w:pPr>
+        <w:pStyle w:val="SourceCode"/>
+      </w:pPr>
+    </w:p>
+    <w:p>
+      <w:pPr>
+        <w:pStyle w:val="SourceCode"/>
+      </w:pPr>
+      <w:r>
+        <w:t>-- Remove the old tables and every row in them (Lesson 4.4).</w:t>
+      </w:r>
+    </w:p>
+    <w:p>
+      <w:pPr>
+        <w:pStyle w:val="SourceCode"/>
+      </w:pPr>
+      <w:r>
+        <w:t>-- contacts_typescript goes first, because in Lessons 4.11 to 4.14 its rows</w:t>
+      </w:r>
+    </w:p>
+    <w:p>
+      <w:pPr>
+        <w:pStyle w:val="SourceCode"/>
+      </w:pPr>
+      <w:r>
+        <w:t>-- pointed at contact_groups_typescript, and the server refuses to drop a</w:t>
+      </w:r>
+    </w:p>
+    <w:p>
+      <w:pPr>
+        <w:pStyle w:val="SourceCode"/>
+      </w:pPr>
+      <w:r>
+        <w:t>-- table that another table's foreign key still points at. Chapter 5 has no</w:t>
+      </w:r>
+    </w:p>
+    <w:p>
+      <w:pPr>
+        <w:pStyle w:val="SourceCode"/>
+      </w:pPr>
+      <w:r>
+        <w:t>-- groups, so contact_groups_typescript is dropped and not created again. IF</w:t>
+      </w:r>
+    </w:p>
+    <w:p>
+      <w:pPr>
+        <w:pStyle w:val="SourceCode"/>
+      </w:pPr>
+      <w:r>
+        <w:t>-- EXISTS skips a table that is not there.</w:t>
+      </w:r>
+    </w:p>
+    <w:p>
+      <w:pPr>
+        <w:pStyle w:val="SourceCode"/>
+      </w:pPr>
+      <w:r>
+        <w:t>DROP TABLE IF EXISTS contacts_typescript;</w:t>
+      </w:r>
+    </w:p>
+    <w:p>
+      <w:pPr>
+        <w:pStyle w:val="SourceCode"/>
+      </w:pPr>
+      <w:r>
+        <w:t>DROP TABLE IF EXISTS contact_groups_typescript;</w:t>
+      </w:r>
+    </w:p>
+    <w:p>
+      <w:pPr>
+        <w:pStyle w:val="SourceCode"/>
+      </w:pPr>
+    </w:p>
+    <w:p>
+      <w:pPr>
+        <w:pStyle w:val="SourceCode"/>
+      </w:pPr>
+      <w:r>
+        <w:t>-- Lesson 4.4's contacts table, with Lesson 4.12's index on name written</w:t>
+      </w:r>
+    </w:p>
+    <w:p>
+      <w:pPr>
+        <w:pStyle w:val="SourceCode"/>
+      </w:pPr>
+      <w:r>
+        <w:t>-- inside CREATE TABLE. Only email is UNIQUE, so two contacts may share a</w:t>
+      </w:r>
+    </w:p>
+    <w:p>
+      <w:pPr>
+        <w:pStyle w:val="SourceCode"/>
+      </w:pPr>
+      <w:r>
+        <w:t>-- name, and phone may be NULL: no phone.</w:t>
+      </w:r>
+    </w:p>
+    <w:p>
+      <w:pPr>
+        <w:pStyle w:val="SourceCode"/>
+      </w:pPr>
+      <w:r>
+        <w:t>CREATE TABLE contacts_typescript (</w:t>
+      </w:r>
+    </w:p>
+    <w:p>
+      <w:pPr>
+        <w:pStyle w:val="SourceCode"/>
+      </w:pPr>
+      <w:r>
+        <w:t xml:space="preserve">    id    INT AUTO_INCREMENT PRIMARY KEY,</w:t>
+      </w:r>
+    </w:p>
+    <w:p>
+      <w:pPr>
+        <w:pStyle w:val="SourceCode"/>
+      </w:pPr>
+      <w:r>
+        <w:t xml:space="preserve">    name  VARCHAR(100) NOT NULL,</w:t>
+      </w:r>
+    </w:p>
+    <w:p>
+      <w:pPr>
+        <w:pStyle w:val="SourceCode"/>
+      </w:pPr>
+      <w:r>
+        <w:t xml:space="preserve">    email VARCHAR(254) NOT NULL UNIQUE,</w:t>
+      </w:r>
+    </w:p>
+    <w:p>
+      <w:pPr>
+        <w:pStyle w:val="SourceCode"/>
+      </w:pPr>
+      <w:r>
+        <w:t xml:space="preserve">    phone VARCHAR(20)  NULL,</w:t>
+      </w:r>
+    </w:p>
+    <w:p>
+      <w:pPr>
+        <w:pStyle w:val="SourceCode"/>
+      </w:pPr>
+      <w:r>
+        <w:t xml:space="preserve">    INDEX idx_contacts_typescript_name (name)</w:t>
+      </w:r>
+    </w:p>
+    <w:p>
+      <w:pPr>
+        <w:pStyle w:val="SourceCode"/>
+      </w:pPr>
+      <w:r>
+        <w:t>) CHARACTER SET utf8mb4;</w:t>
+      </w:r>
+    </w:p>
+    <w:p>
+      <w:pPr>
+        <w:pStyle w:val="SourceCode"/>
+      </w:pPr>
+    </w:p>
+    <w:p>
+      <w:pPr>
+        <w:pStyle w:val="SourceCode"/>
+      </w:pPr>
+      <w:r>
+        <w:t>-- Lesson 4.6's three contacts, ids 1, 2, 3. Grace Hopper has no phone.</w:t>
+      </w:r>
+    </w:p>
+    <w:p>
+      <w:pPr>
+        <w:pStyle w:val="SourceCode"/>
+      </w:pPr>
+      <w:r>
+        <w:t>INSERT INTO contacts_typescript (name, email, phone)</w:t>
+      </w:r>
+    </w:p>
+    <w:p>
+      <w:pPr>
+        <w:pStyle w:val="SourceCode"/>
+      </w:pPr>
+      <w:r>
+        <w:t xml:space="preserve">    VALUES ('Ada Lovelace', 'ada@example.com', '555-0100');</w:t>
+      </w:r>
+    </w:p>
+    <w:p>
+      <w:pPr>
+        <w:pStyle w:val="SourceCode"/>
+      </w:pPr>
+      <w:r>
+        <w:t>INSERT INTO contacts_typescript (name, email, phone)</w:t>
+      </w:r>
+    </w:p>
+    <w:p>
+      <w:pPr>
+        <w:pStyle w:val="SourceCode"/>
+        <w:keepNext/>
+      </w:pPr>
+      <w:r>
+        <w:t xml:space="preserve">    VALUES ('Grace Hopper', 'grace@example.com', NULL);</w:t>
+      </w:r>
+    </w:p>
+    <w:p>
+      <w:pPr>
+        <w:pStyle w:val="SourceCode"/>
+        <w:keepNext/>
+      </w:pPr>
+      <w:r>
+        <w:t>INSERT INTO contacts_typescript (name, email, phone)</w:t>
+      </w:r>
+    </w:p>
+    <w:p>
+      <w:pPr>
+        <w:pStyle w:val="SourceCode"/>
+      </w:pPr>
+      <w:r>
+        <w:t xml:space="preserve">    VALUES ('Alan Turing', 'alan@example.com', '555-0102');</w:t>
+      </w:r>
+    </w:p>
+    <w:p>
+      <w:pPr>
+        <w:keepNext/>
+      </w:pPr>
+    </w:p>
+    <w:p>
+      <w:r>
+        <w:t>The first client command is Lesson 4.2's CREATE DATABASE IF NOT EXISTS spa_contacts, so this lesson works even if you start here. The next six run the files, one per language. Remember, source is the mysql client's own command, and it runs every statement in a file, in order, printing nothing when they succeed; the client runs its own commands from -e only when --commands is given (Lesson 4.6). On Linux or macOS, &lt; sends the file to the client's input instead, which does the same. The last shows the C progr</w:t>
+      </w:r>
+      <w:r>
+        <w:t>ams' table, contacts_c (Lesson 4.6). Remember, MYSQL_PWD lasts only until the block's last line, -D names the database, and -t prints the answer as a table.</w:t>
+      </w:r>
+    </w:p>
+    <w:p>
+      <w:pPr>
+        <w:keepNext/>
+      </w:pPr>
+    </w:p>
+    <w:p>
+      <w:pPr>
+        <w:pStyle w:val="Heading3"/>
+      </w:pPr>
+      <w:r>
         <w:t>Windows PowerShell Data Reset</w:t>
       </w:r>
     </w:p>
@@ -2640,7 +4024,6 @@
     <w:p>
       <w:pPr>
         <w:pStyle w:val="CommandBlock"/>
-        <w:keepNext/>
       </w:pPr>
       <w:r>
         <w:t>&amp; $mysql -u devuser -h 127.0.0.1 -P 3306 `</w:t>
@@ -2649,7 +4032,6 @@
     <w:p>
       <w:pPr>
         <w:pStyle w:val="CommandBlock"/>
-        <w:keepNext/>
       </w:pPr>
       <w:r>
         <w:t xml:space="preserve">    -e "CREATE DATABASE IF NOT EXISTS spa_contacts"</w:t>
@@ -2658,7 +4040,6 @@
     <w:p>
       <w:pPr>
         <w:pStyle w:val="CommandBlock"/>
-        <w:keepNext/>
       </w:pPr>
       <w:r>
         <w:t>&amp; $mysql -u devuser -h 127.0.0.1 -P 3306 -D spa_contacts --commands `</w:t>
@@ -2667,15 +4048,94 @@
     <w:p>
       <w:pPr>
         <w:pStyle w:val="CommandBlock"/>
-        <w:keepNext/>
-      </w:pPr>
-      <w:r>
-        <w:t xml:space="preserve">    -e "source ./sql/reset_contacts.sql"</w:t>
+      </w:pPr>
+      <w:r>
+        <w:t xml:space="preserve">    -e "source ./sql/reset_contacts_c.sql"</w:t>
       </w:r>
     </w:p>
     <w:p>
       <w:pPr>
         <w:pStyle w:val="CommandBlock"/>
+      </w:pPr>
+      <w:r>
+        <w:t>&amp; $mysql -u devuser -h 127.0.0.1 -P 3306 -D spa_contacts --commands `</w:t>
+      </w:r>
+    </w:p>
+    <w:p>
+      <w:pPr>
+        <w:pStyle w:val="CommandBlock"/>
+      </w:pPr>
+      <w:r>
+        <w:t xml:space="preserve">    -e "source ./sql/reset_contacts_cpp.sql"</w:t>
+      </w:r>
+    </w:p>
+    <w:p>
+      <w:pPr>
+        <w:pStyle w:val="CommandBlock"/>
+      </w:pPr>
+      <w:r>
+        <w:t>&amp; $mysql -u devuser -h 127.0.0.1 -P 3306 -D spa_contacts --commands `</w:t>
+      </w:r>
+    </w:p>
+    <w:p>
+      <w:pPr>
+        <w:pStyle w:val="CommandBlock"/>
+      </w:pPr>
+      <w:r>
+        <w:t xml:space="preserve">    -e "source ./sql/reset_contacts_csharp.sql"</w:t>
+      </w:r>
+    </w:p>
+    <w:p>
+      <w:pPr>
+        <w:pStyle w:val="CommandBlock"/>
+      </w:pPr>
+      <w:r>
+        <w:t>&amp; $mysql -u devuser -h 127.0.0.1 -P 3306 -D spa_contacts --commands `</w:t>
+      </w:r>
+    </w:p>
+    <w:p>
+      <w:pPr>
+        <w:pStyle w:val="CommandBlock"/>
+      </w:pPr>
+      <w:r>
+        <w:t xml:space="preserve">    -e "source ./sql/reset_contacts_go.sql"</w:t>
+      </w:r>
+    </w:p>
+    <w:p>
+      <w:pPr>
+        <w:pStyle w:val="CommandBlock"/>
+      </w:pPr>
+      <w:r>
+        <w:t>&amp; $mysql -u devuser -h 127.0.0.1 -P 3306 -D spa_contacts --commands `</w:t>
+      </w:r>
+    </w:p>
+    <w:p>
+      <w:pPr>
+        <w:pStyle w:val="CommandBlock"/>
+      </w:pPr>
+      <w:r>
+        <w:t xml:space="preserve">    -e "source ./sql/reset_contacts_python.sql"</w:t>
+      </w:r>
+    </w:p>
+    <w:p>
+      <w:pPr>
+        <w:pStyle w:val="CommandBlock"/>
+      </w:pPr>
+      <w:r>
+        <w:t>&amp; $mysql -u devuser -h 127.0.0.1 -P 3306 -D spa_contacts --commands `</w:t>
+      </w:r>
+    </w:p>
+    <w:p>
+      <w:pPr>
+        <w:pStyle w:val="CommandBlock"/>
+      </w:pPr>
+      <w:r>
+        <w:t xml:space="preserve">    -e "source ./sql/reset_contacts_typescript.sql"</w:t>
+      </w:r>
+    </w:p>
+    <w:p>
+      <w:pPr>
+        <w:pStyle w:val="CommandBlock"/>
         <w:keepNext/>
       </w:pPr>
       <w:r>
@@ -2688,7 +4148,7 @@
         <w:keepNext/>
       </w:pPr>
       <w:r>
-        <w:t xml:space="preserve">    -e "SELECT id, name, email, phone FROM contacts ORDER BY id"</w:t>
+        <w:t xml:space="preserve">    -e "SELECT id, name, email, phone FROM contacts_c ORDER BY id"</w:t>
       </w:r>
     </w:p>
     <w:p>
@@ -2733,7 +4193,6 @@
     <w:p>
       <w:pPr>
         <w:pStyle w:val="CommandBlock"/>
-        <w:keepNext/>
       </w:pPr>
       <w:r>
         <w:t xml:space="preserve">    -e "CREATE DATABASE IF NOT EXISTS spa_contacts"</w:t>
@@ -2742,15 +4201,102 @@
     <w:p>
       <w:pPr>
         <w:pStyle w:val="CommandBlock"/>
-        <w:keepNext/>
-      </w:pPr>
-      <w:r>
-        <w:t>mysql -u devuser -h 127.0.0.1 -P 3306 -D spa_contacts &lt; ./sql/reset_contacts.sql</w:t>
+      </w:pPr>
+      <w:r>
+        <w:t>mysql -u devuser -h 127.0.0.1 -P 3306 -D spa_contacts \</w:t>
       </w:r>
     </w:p>
     <w:p>
       <w:pPr>
         <w:pStyle w:val="CommandBlock"/>
+      </w:pPr>
+      <w:r>
+        <w:t xml:space="preserve">    &lt; ./sql/reset_contacts_c.sql</w:t>
+      </w:r>
+    </w:p>
+    <w:p>
+      <w:pPr>
+        <w:pStyle w:val="CommandBlock"/>
+      </w:pPr>
+      <w:r>
+        <w:t>mysql -u devuser -h 127.0.0.1 -P 3306 -D spa_contacts \</w:t>
+      </w:r>
+    </w:p>
+    <w:p>
+      <w:pPr>
+        <w:pStyle w:val="CommandBlock"/>
+      </w:pPr>
+      <w:r>
+        <w:t xml:space="preserve">    &lt; ./sql/reset_contacts_cpp.sql</w:t>
+      </w:r>
+    </w:p>
+    <w:p>
+      <w:pPr>
+        <w:pStyle w:val="CommandBlock"/>
+      </w:pPr>
+      <w:r>
+        <w:t>mysql -u devuser -h 127.0.0.1 -P 3306 -D spa_contacts \</w:t>
+      </w:r>
+    </w:p>
+    <w:p>
+      <w:pPr>
+        <w:pStyle w:val="CommandBlock"/>
+      </w:pPr>
+      <w:r>
+        <w:t xml:space="preserve">    &lt; ./sql/reset_contacts_csharp.sql</w:t>
+      </w:r>
+    </w:p>
+    <w:p>
+      <w:pPr>
+        <w:pStyle w:val="CommandBlock"/>
+      </w:pPr>
+      <w:r>
+        <w:t>mysql -u devuser -h 127.0.0.1 -P 3306 -D spa_contacts \</w:t>
+      </w:r>
+    </w:p>
+    <w:p>
+      <w:pPr>
+        <w:pStyle w:val="CommandBlock"/>
+      </w:pPr>
+      <w:r>
+        <w:t xml:space="preserve">    &lt; ./sql/reset_contacts_go.sql</w:t>
+      </w:r>
+    </w:p>
+    <w:p>
+      <w:pPr>
+        <w:pStyle w:val="CommandBlock"/>
+      </w:pPr>
+      <w:r>
+        <w:t>mysql -u devuser -h 127.0.0.1 -P 3306 -D spa_contacts \</w:t>
+      </w:r>
+    </w:p>
+    <w:p>
+      <w:pPr>
+        <w:pStyle w:val="CommandBlock"/>
+      </w:pPr>
+      <w:r>
+        <w:t xml:space="preserve">    &lt; ./sql/reset_contacts_python.sql</w:t>
+      </w:r>
+    </w:p>
+    <w:p>
+      <w:pPr>
+        <w:pStyle w:val="CommandBlock"/>
+      </w:pPr>
+      <w:r>
+        <w:t>mysql -u devuser -h 127.0.0.1 -P 3306 -D spa_contacts \</w:t>
+      </w:r>
+    </w:p>
+    <w:p>
+      <w:pPr>
+        <w:pStyle w:val="CommandBlock"/>
+      </w:pPr>
+      <w:r>
+        <w:t xml:space="preserve">    &lt; ./sql/reset_contacts_typescript.sql</w:t>
+      </w:r>
+    </w:p>
+    <w:p>
+      <w:pPr>
+        <w:pStyle w:val="CommandBlock"/>
         <w:keepNext/>
       </w:pPr>
       <w:r>
@@ -2763,7 +4309,7 @@
         <w:keepNext/>
       </w:pPr>
       <w:r>
-        <w:t xml:space="preserve">    -e "SELECT id, name, email, phone FROM contacts ORDER BY id"</w:t>
+        <w:t xml:space="preserve">    -e "SELECT id, name, email, phone FROM contacts_c ORDER BY id"</w:t>
       </w:r>
     </w:p>
     <w:p>
@@ -2784,7 +4330,7 @@
         <w:keepNext/>
       </w:pPr>
       <w:r>
-        <w:t>The first two commands print nothing. The query prints exactly this table:</w:t>
+        <w:t>The first seven commands print nothing. The query prints exactly this table; every other language's table holds the same rows:</w:t>
       </w:r>
     </w:p>
     <w:p>
@@ -2994,7 +4540,7 @@
         <w:pStyle w:val="ListBullet"/>
       </w:pPr>
       <w:r>
-        <w:t>Error: Table 'spa_contacts.contacts' doesn't exist after an add: the Data Reset has not run (error 1146). Run it, then the program again.</w:t>
+        <w:t>Error: Table 'spa_contacts.contacts_c' doesn't exist after an add, with your language's table: the Data Reset has not run (error 1146). Run it, then the program again.</w:t>
       </w:r>
     </w:p>
     <w:p>
@@ -3257,6 +4803,14 @@
         <w:pStyle w:val="SourceCode"/>
       </w:pPr>
       <w:r>
+        <w:t>// Remember, contacts_c is C's own table (Lesson 4.4).</w:t>
+      </w:r>
+    </w:p>
+    <w:p>
+      <w:pPr>
+        <w:pStyle w:val="SourceCode"/>
+      </w:pPr>
+      <w:r>
         <w:t>#define INSERT_CONTACT \</w:t>
       </w:r>
     </w:p>
@@ -3265,7 +4819,7 @@
         <w:pStyle w:val="SourceCode"/>
       </w:pPr>
       <w:r>
-        <w:t xml:space="preserve">    "INSERT INTO contacts (name, email, phone) VALUES (?, ?, ?)"</w:t>
+        <w:t xml:space="preserve">    "INSERT INTO contacts_c (name, email, phone) VALUES (?, ?, ?)"</w:t>
       </w:r>
     </w:p>
     <w:p>
@@ -3281,7 +4835,7 @@
         <w:pStyle w:val="SourceCode"/>
       </w:pPr>
       <w:r>
-        <w:t xml:space="preserve">    "SELECT id, name, email, phone FROM contacts WHERE id = ?"</w:t>
+        <w:t xml:space="preserve">    "SELECT id, name, email, phone FROM contacts_c WHERE id = ?"</w:t>
       </w:r>
     </w:p>
     <w:p>
@@ -5561,7 +7115,7 @@
         <w:keepNext/>
       </w:pPr>
       <w:r>
-        <w:t>Run the block from the lesson-5.1 folder, in a terminal that has SPA_DB_PASSWORD, and type the commands as Check Your Results shows. The middle lines are the Data Reset again, so the table holds exactly its three contacts when the program starts.</w:t>
+        <w:t>Run the block from the lesson-5.1 folder, in a terminal that has SPA_DB_PASSWORD, and type the commands as Check Your Results shows. The middle lines run your language's reset file again, sql/reset_contacts_c.sql, so its table, contacts_c, holds exactly its three contacts when the program starts.</w:t>
       </w:r>
     </w:p>
     <w:p>
@@ -5638,7 +7192,7 @@
         <w:keepNext/>
       </w:pPr>
       <w:r>
-        <w:t xml:space="preserve">    -e "source ./sql/reset_contacts.sql"</w:t>
+        <w:t xml:space="preserve">    -e "source ./sql/reset_contacts_c.sql"</w:t>
       </w:r>
     </w:p>
     <w:p>
@@ -5713,7 +7267,7 @@
         <w:keepNext/>
       </w:pPr>
       <w:r>
-        <w:t>mysql -u devuser -h 127.0.0.1 -P 3306 -D spa_contacts &lt; ./sql/reset_contacts.sql</w:t>
+        <w:t>mysql -u devuser -h 127.0.0.1 -P 3306 -D spa_contacts \</w:t>
       </w:r>
     </w:p>
     <w:p>
@@ -5722,6 +7276,15 @@
         <w:keepNext/>
       </w:pPr>
       <w:r>
+        <w:t xml:space="preserve">    &lt; ./sql/reset_contacts_c.sql</w:t>
+      </w:r>
+    </w:p>
+    <w:p>
+      <w:pPr>
+        <w:pStyle w:val="CommandBlock"/>
+        <w:keepNext/>
+      </w:pPr>
+      <w:r>
         <w:t>unset MYSQL_PWD</w:t>
       </w:r>
     </w:p>
@@ -5757,7 +7320,7 @@
     </w:p>
     <w:p>
       <w:r>
-        <w:t>The block builds the program, resets the table to the Data Reset's three contacts, and runs it. Type the commands and answers of the Required Clean-Run Output in Validation Rules, as its first paragraph describes. Your screen must match the Required Clean-Run Output line for line, with the same spelling, spacing, and capitalization, and $LASTEXITCODE (echo $? on Linux or macOS) must print 0.</w:t>
+        <w:t>The block builds the program, resets your language's table to the Data Reset's three contacts, and runs it. Type the commands and answers of the Required Clean-Run Output in Validation Rules, as its first paragraph describes. Your screen must match the Required Clean-Run Output line for line, with the same spelling, spacing, and capitalization, and $LASTEXITCODE (echo $? on Linux or macOS) must print 0.</w:t>
       </w:r>
     </w:p>
     <w:p>
@@ -6377,7 +7940,7 @@
         <w:pStyle w:val="SourceCode"/>
       </w:pPr>
       <w:r>
-        <w:t xml:space="preserve">    "INSERT INTO contacts (name, email, phone) VALUES (?, ?, ?)"</w:t>
+        <w:t xml:space="preserve">    "INSERT INTO contacts_c (name, email, phone) VALUES (?, ?, ?)"</w:t>
       </w:r>
     </w:p>
     <w:p>
@@ -6393,7 +7956,7 @@
         <w:pStyle w:val="SourceCode"/>
       </w:pPr>
       <w:r>
-        <w:t xml:space="preserve">    "SELECT id, name, email, phone FROM contacts WHERE id = ?"</w:t>
+        <w:t xml:space="preserve">    "SELECT id, name, email, phone FROM contacts_c WHERE id = ?"</w:t>
       </w:r>
     </w:p>
     <w:p>
@@ -9421,7 +10984,7 @@
         <w:keepNext/>
       </w:pPr>
       <w:r>
-        <w:t xml:space="preserve">    -e "source ./sql/reset_contacts.sql"</w:t>
+        <w:t xml:space="preserve">    -e "source ./sql/reset_contacts_c.sql"</w:t>
       </w:r>
     </w:p>
     <w:p>
@@ -9496,7 +11059,7 @@
         <w:keepNext/>
       </w:pPr>
       <w:r>
-        <w:t>mysql -u devuser -h 127.0.0.1 -P 3306 -D spa_contacts &lt; ./sql/reset_contacts.sql</w:t>
+        <w:t>mysql -u devuser -h 127.0.0.1 -P 3306 -D spa_contacts \</w:t>
       </w:r>
     </w:p>
     <w:p>
@@ -9505,6 +11068,15 @@
         <w:keepNext/>
       </w:pPr>
       <w:r>
+        <w:t xml:space="preserve">    &lt; ./sql/reset_contacts_c.sql</w:t>
+      </w:r>
+    </w:p>
+    <w:p>
+      <w:pPr>
+        <w:pStyle w:val="CommandBlock"/>
+        <w:keepNext/>
+      </w:pPr>
+      <w:r>
         <w:t>unset MYSQL_PWD</w:t>
       </w:r>
     </w:p>
@@ -9540,7 +11112,7 @@
     </w:p>
     <w:p>
       <w:r>
-        <w:t>The block builds the program, resets the table to the Data Reset's three contacts, and runs it. Type the commands and answers of the Required Clean-Run Output in Validation Rules, as its first paragraph describes. Your screen must match the Required Clean-Run Output line for line, with the same spelling, spacing, and capitalization, and $LASTEXITCODE (echo $? on Linux or macOS) must print 0.</w:t>
+        <w:t>The block builds the program, resets your language's table to the Data Reset's three contacts, and runs it. Type the commands and answers of the Required Clean-Run Output in Validation Rules, as its first paragraph describes. Your screen must match the Required Clean-Run Output line for line, with the same spelling, spacing, and capitalization, and $LASTEXITCODE (echo $? on Linux or macOS) must print 0.</w:t>
       </w:r>
     </w:p>
     <w:p>
@@ -10006,6 +11578,14 @@
         <w:pStyle w:val="SourceCode"/>
       </w:pPr>
       <w:r>
+        <w:t>// Remember, contacts_cpp is C++'s own table (Lesson 4.4).</w:t>
+      </w:r>
+    </w:p>
+    <w:p>
+      <w:pPr>
+        <w:pStyle w:val="SourceCode"/>
+      </w:pPr>
+      <w:r>
         <w:t>const std::string INSERT_CONTACT =</w:t>
       </w:r>
     </w:p>
@@ -10014,7 +11594,7 @@
         <w:pStyle w:val="SourceCode"/>
       </w:pPr>
       <w:r>
-        <w:t xml:space="preserve">    "INSERT INTO contacts (name, email, phone) VALUES (?, ?, ?)";</w:t>
+        <w:t xml:space="preserve">    "INSERT INTO contacts_cpp (name, email, phone) VALUES (?, ?, ?)";</w:t>
       </w:r>
     </w:p>
     <w:p>
@@ -10030,7 +11610,7 @@
         <w:pStyle w:val="SourceCode"/>
       </w:pPr>
       <w:r>
-        <w:t xml:space="preserve">    "SELECT id, name, email, phone FROM contacts WHERE id = ?";</w:t>
+        <w:t xml:space="preserve">    "SELECT id, name, email, phone FROM contacts_cpp WHERE id = ?";</w:t>
       </w:r>
     </w:p>
     <w:p>
@@ -11761,7 +13341,7 @@
         <w:keepNext/>
       </w:pPr>
       <w:r>
-        <w:t>Run the block from the lesson-5.1 folder, in a terminal that has SPA_DB_PASSWORD, and type the commands as Check Your Results shows. The middle lines are the Data Reset again, so the table holds exactly its three contacts when the program starts.</w:t>
+        <w:t>Run the block from the lesson-5.1 folder, in a terminal that has SPA_DB_PASSWORD, and type the commands as Check Your Results shows. The middle lines run your language's reset file again, sql/reset_contacts_cpp.sql, so its table, contacts_cpp, holds exactly its three contacts when the program starts.</w:t>
       </w:r>
     </w:p>
     <w:p>
@@ -11874,7 +13454,7 @@
         <w:keepNext/>
       </w:pPr>
       <w:r>
-        <w:t xml:space="preserve">    -e "source ./sql/reset_contacts.sql"</w:t>
+        <w:t xml:space="preserve">    -e "source ./sql/reset_contacts_cpp.sql"</w:t>
       </w:r>
     </w:p>
     <w:p>
@@ -11967,7 +13547,7 @@
         <w:keepNext/>
       </w:pPr>
       <w:r>
-        <w:t>mysql -u devuser -h 127.0.0.1 -P 3306 -D spa_contacts &lt; ./sql/reset_contacts.sql</w:t>
+        <w:t>mysql -u devuser -h 127.0.0.1 -P 3306 -D spa_contacts \</w:t>
       </w:r>
     </w:p>
     <w:p>
@@ -11976,6 +13556,15 @@
         <w:keepNext/>
       </w:pPr>
       <w:r>
+        <w:t xml:space="preserve">    &lt; ./sql/reset_contacts_cpp.sql</w:t>
+      </w:r>
+    </w:p>
+    <w:p>
+      <w:pPr>
+        <w:pStyle w:val="CommandBlock"/>
+        <w:keepNext/>
+      </w:pPr>
+      <w:r>
         <w:t>unset MYSQL_PWD</w:t>
       </w:r>
     </w:p>
@@ -12011,10 +13600,10 @@
     </w:p>
     <w:p>
       <w:r>
-        <w:t xml:space="preserve">Launch-VsDevShell prints a short Visual Studio banner, and cl prints the name of each file it compiles; those lines come before the program's output. The block builds the program, resets the table to the Data Reset's three contacts, and runs it. Type the commands and answers of the Required Clean-Run Output in Validation Rules, as its first paragraph describes. Your screen must match the Required Clean-Run Output line for line, with the same spelling, spacing, and capitalization, and $LASTEXITCODE (echo $? </w:t>
-      </w:r>
-      <w:r>
-        <w:t>on Linux or macOS) must print 0.</w:t>
+        <w:t>Launch-VsDevShell prints a short Visual Studio banner, and cl prints the name of each file it compiles; those lines come before the program's output. The block builds the program, resets your language's table to the Data Reset's three contacts, and runs it. Type the commands and answers of the Required Clean-Run Output in Validation Rules, as its first paragraph describes. Your screen must match the Required Clean-Run Output line for line, with the same spelling, spacing, and capitalization, and $LASTEXITCO</w:t>
+      </w:r>
+      <w:r>
+        <w:t>DE (echo $? on Linux or macOS) must print 0.</w:t>
       </w:r>
     </w:p>
     <w:p>
@@ -12618,7 +14207,7 @@
         <w:pStyle w:val="SourceCode"/>
       </w:pPr>
       <w:r>
-        <w:t xml:space="preserve">    "INSERT INTO contacts (name, email, phone) VALUES (?, ?, ?)";</w:t>
+        <w:t xml:space="preserve">    "INSERT INTO contacts_cpp (name, email, phone) VALUES (?, ?, ?)";</w:t>
       </w:r>
     </w:p>
     <w:p>
@@ -12634,7 +14223,7 @@
         <w:pStyle w:val="SourceCode"/>
       </w:pPr>
       <w:r>
-        <w:t xml:space="preserve">    "SELECT id, name, email, phone FROM contacts WHERE id = ?";</w:t>
+        <w:t xml:space="preserve">    "SELECT id, name, email, phone FROM contacts_cpp WHERE id = ?";</w:t>
       </w:r>
     </w:p>
     <w:p>
@@ -15231,7 +16820,7 @@
         <w:keepNext/>
       </w:pPr>
       <w:r>
-        <w:t xml:space="preserve">    -e "source ./sql/reset_contacts.sql"</w:t>
+        <w:t xml:space="preserve">    -e "source ./sql/reset_contacts_cpp.sql"</w:t>
       </w:r>
     </w:p>
     <w:p>
@@ -15324,7 +16913,7 @@
         <w:keepNext/>
       </w:pPr>
       <w:r>
-        <w:t>mysql -u devuser -h 127.0.0.1 -P 3306 -D spa_contacts &lt; ./sql/reset_contacts.sql</w:t>
+        <w:t>mysql -u devuser -h 127.0.0.1 -P 3306 -D spa_contacts \</w:t>
       </w:r>
     </w:p>
     <w:p>
@@ -15333,6 +16922,15 @@
         <w:keepNext/>
       </w:pPr>
       <w:r>
+        <w:t xml:space="preserve">    &lt; ./sql/reset_contacts_cpp.sql</w:t>
+      </w:r>
+    </w:p>
+    <w:p>
+      <w:pPr>
+        <w:pStyle w:val="CommandBlock"/>
+        <w:keepNext/>
+      </w:pPr>
+      <w:r>
         <w:t>unset MYSQL_PWD</w:t>
       </w:r>
     </w:p>
@@ -15368,10 +16966,10 @@
     </w:p>
     <w:p>
       <w:r>
-        <w:t xml:space="preserve">Launch-VsDevShell prints a short Visual Studio banner, and cl prints the name of each file it compiles; those lines come before the program's output. The block builds the program, resets the table to the Data Reset's three contacts, and runs it. Type the commands and answers of the Required Clean-Run Output in Validation Rules, as its first paragraph describes. Your screen must match the Required Clean-Run Output line for line, with the same spelling, spacing, and capitalization, and $LASTEXITCODE (echo $? </w:t>
-      </w:r>
-      <w:r>
-        <w:t>on Linux or macOS) must print 0.</w:t>
+        <w:t>Launch-VsDevShell prints a short Visual Studio banner, and cl prints the name of each file it compiles; those lines come before the program's output. The block builds the program, resets your language's table to the Data Reset's three contacts, and runs it. Type the commands and answers of the Required Clean-Run Output in Validation Rules, as its first paragraph describes. Your screen must match the Required Clean-Run Output line for line, with the same spelling, spacing, and capitalization, and $LASTEXITCO</w:t>
+      </w:r>
+      <w:r>
+        <w:t>DE (echo $? on Linux or macOS) must print 0.</w:t>
       </w:r>
     </w:p>
     <w:p>
@@ -15829,6 +17427,14 @@
         <w:pStyle w:val="SourceCode"/>
       </w:pPr>
       <w:r>
+        <w:t xml:space="preserve">    // Remember, contacts_csharp is C#'s own table (Lesson 4.4).</w:t>
+      </w:r>
+    </w:p>
+    <w:p>
+      <w:pPr>
+        <w:pStyle w:val="SourceCode"/>
+      </w:pPr>
+      <w:r>
         <w:t xml:space="preserve">    private const string InsertContactSql =</w:t>
       </w:r>
     </w:p>
@@ -15837,7 +17443,7 @@
         <w:pStyle w:val="SourceCode"/>
       </w:pPr>
       <w:r>
-        <w:t xml:space="preserve">        "INSERT INTO contacts (name, email, phone) " +</w:t>
+        <w:t xml:space="preserve">        "INSERT INTO contacts_csharp (name, email, phone) " +</w:t>
       </w:r>
     </w:p>
     <w:p>
@@ -15861,7 +17467,7 @@
         <w:pStyle w:val="SourceCode"/>
       </w:pPr>
       <w:r>
-        <w:t xml:space="preserve">        "SELECT id, name, email, phone FROM contacts WHERE id = @id";</w:t>
+        <w:t xml:space="preserve">        "SELECT id, name, email, phone FROM contacts_csharp WHERE id = @id";</w:t>
       </w:r>
     </w:p>
     <w:p>
@@ -17843,7 +19449,7 @@
         <w:keepNext/>
       </w:pPr>
       <w:r>
-        <w:t>Run the block from the lesson-5.1 folder, in a terminal that has SPA_DB_PASSWORD, and type the commands as Check Your Results shows. The middle lines are the Data Reset again, so the table holds exactly its three contacts when the program starts.</w:t>
+        <w:t>Run the block from the lesson-5.1 folder, in a terminal that has SPA_DB_PASSWORD, and type the commands as Check Your Results shows. The middle lines run your language's reset file again, sql/reset_contacts_csharp.sql, so its table, contacts_csharp, holds exactly its three contacts when the program starts.</w:t>
       </w:r>
     </w:p>
     <w:p>
@@ -17893,7 +19499,7 @@
         <w:keepNext/>
       </w:pPr>
       <w:r>
-        <w:t xml:space="preserve">    -e "source ./sql/reset_contacts.sql"</w:t>
+        <w:t xml:space="preserve">    -e "source ./sql/reset_contacts_csharp.sql"</w:t>
       </w:r>
     </w:p>
     <w:p>
@@ -17959,7 +19565,7 @@
         <w:keepNext/>
       </w:pPr>
       <w:r>
-        <w:t>mysql -u devuser -h 127.0.0.1 -P 3306 -D spa_contacts &lt; ./sql/reset_contacts.sql</w:t>
+        <w:t>mysql -u devuser -h 127.0.0.1 -P 3306 -D spa_contacts \</w:t>
       </w:r>
     </w:p>
     <w:p>
@@ -17968,6 +19574,15 @@
         <w:keepNext/>
       </w:pPr>
       <w:r>
+        <w:t xml:space="preserve">    &lt; ./sql/reset_contacts_csharp.sql</w:t>
+      </w:r>
+    </w:p>
+    <w:p>
+      <w:pPr>
+        <w:pStyle w:val="CommandBlock"/>
+        <w:keepNext/>
+      </w:pPr>
+      <w:r>
         <w:t>unset MYSQL_PWD</w:t>
       </w:r>
     </w:p>
@@ -18003,10 +19618,10 @@
     </w:p>
     <w:p>
       <w:r>
-        <w:t>dotnet build shows its progress first and ends with a line such as Build succeeded in 1.2s (your time differs); those lines are not part of the program's output. The block builds the program, resets the table to the Data Reset's three contacts, and runs it. Type the commands and answers of the Required Clean-Run Output in Validation Rules, as its first paragraph describes. Your screen must match the Required Clean-Run Output line for line, with the same spelling, spacing, and capitalization, and $LASTEXITCO</w:t>
-      </w:r>
-      <w:r>
-        <w:t>DE (echo $? on Linux or macOS) must print 0.</w:t>
+        <w:t>dotnet build shows its progress first and ends with a line such as Build succeeded in 1.2s (your time differs); those lines are not part of the program's output. The block builds the program, resets your language's table to the Data Reset's three contacts, and runs it. Type the commands and answers of the Required Clean-Run Output in Validation Rules, as its first paragraph describes. Your screen must match the Required Clean-Run Output line for line, with the same spelling, spacing, and capitalization, and</w:t>
+      </w:r>
+      <w:r>
+        <w:t xml:space="preserve"> $LASTEXITCODE (echo $? on Linux or macOS) must print 0.</w:t>
       </w:r>
     </w:p>
     <w:p>
@@ -18384,7 +19999,7 @@
         <w:pStyle w:val="SourceCode"/>
       </w:pPr>
       <w:r>
-        <w:t xml:space="preserve">        "INSERT INTO contacts (name, email, phone) " +</w:t>
+        <w:t xml:space="preserve">        "INSERT INTO contacts_csharp (name, email, phone) " +</w:t>
       </w:r>
     </w:p>
     <w:p>
@@ -18408,7 +20023,7 @@
         <w:pStyle w:val="SourceCode"/>
       </w:pPr>
       <w:r>
-        <w:t xml:space="preserve">        "SELECT id, name, email, phone FROM contacts WHERE id = @id";</w:t>
+        <w:t xml:space="preserve">        "SELECT id, name, email, phone FROM contacts_csharp WHERE id = @id";</w:t>
       </w:r>
     </w:p>
     <w:p>
@@ -21377,7 +22992,7 @@
         <w:keepNext/>
       </w:pPr>
       <w:r>
-        <w:t xml:space="preserve">    -e "source ./sql/reset_contacts.sql"</w:t>
+        <w:t xml:space="preserve">    -e "source ./sql/reset_contacts_csharp.sql"</w:t>
       </w:r>
     </w:p>
     <w:p>
@@ -21443,7 +23058,7 @@
         <w:keepNext/>
       </w:pPr>
       <w:r>
-        <w:t>mysql -u devuser -h 127.0.0.1 -P 3306 -D spa_contacts &lt; ./sql/reset_contacts.sql</w:t>
+        <w:t>mysql -u devuser -h 127.0.0.1 -P 3306 -D spa_contacts \</w:t>
       </w:r>
     </w:p>
     <w:p>
@@ -21452,6 +23067,15 @@
         <w:keepNext/>
       </w:pPr>
       <w:r>
+        <w:t xml:space="preserve">    &lt; ./sql/reset_contacts_csharp.sql</w:t>
+      </w:r>
+    </w:p>
+    <w:p>
+      <w:pPr>
+        <w:pStyle w:val="CommandBlock"/>
+        <w:keepNext/>
+      </w:pPr>
+      <w:r>
         <w:t>unset MYSQL_PWD</w:t>
       </w:r>
     </w:p>
@@ -21487,10 +23111,10 @@
     </w:p>
     <w:p>
       <w:r>
-        <w:t>dotnet build shows its progress first and ends with a line such as Build succeeded in 1.2s (your time differs); those lines are not part of the program's output. The block builds the program, resets the table to the Data Reset's three contacts, and runs it. Type the commands and answers of the Required Clean-Run Output in Validation Rules, as its first paragraph describes. Your screen must match the Required Clean-Run Output line for line, with the same spelling, spacing, and capitalization, and $LASTEXITCO</w:t>
-      </w:r>
-      <w:r>
-        <w:t>DE (echo $? on Linux or macOS) must print 0.</w:t>
+        <w:t>dotnet build shows its progress first and ends with a line such as Build succeeded in 1.2s (your time differs); those lines are not part of the program's output. The block builds the program, resets your language's table to the Data Reset's three contacts, and runs it. Type the commands and answers of the Required Clean-Run Output in Validation Rules, as its first paragraph describes. Your screen must match the Required Clean-Run Output line for line, with the same spelling, spacing, and capitalization, and</w:t>
+      </w:r>
+      <w:r>
+        <w:t xml:space="preserve"> $LASTEXITCODE (echo $? on Linux or macOS) must print 0.</w:t>
       </w:r>
     </w:p>
     <w:p>
@@ -22030,7 +23654,15 @@
         <w:pStyle w:val="SourceCode"/>
       </w:pPr>
       <w:r>
-        <w:t>const insertContactSQL = "INSERT INTO contacts (name, email, phone) " +</w:t>
+        <w:t>// Remember, contacts_go is Go's own table (Lesson 4.4).</w:t>
+      </w:r>
+    </w:p>
+    <w:p>
+      <w:pPr>
+        <w:pStyle w:val="SourceCode"/>
+      </w:pPr>
+      <w:r>
+        <w:t>const insertContactSQL = "INSERT INTO contacts_go (name, email, phone) " +</w:t>
       </w:r>
     </w:p>
     <w:p>
@@ -22046,7 +23678,7 @@
         <w:pStyle w:val="SourceCode"/>
       </w:pPr>
       <w:r>
-        <w:t>const selectContactSQL = "SELECT id, name, email, phone FROM contacts " +</w:t>
+        <w:t>const selectContactSQL = "SELECT id, name, email, phone FROM contacts_go " +</w:t>
       </w:r>
     </w:p>
     <w:p>
@@ -23769,7 +25401,7 @@
         <w:keepNext/>
       </w:pPr>
       <w:r>
-        <w:t>Run the block from the lesson-5.1 folder, in a terminal that has SPA_DB_PASSWORD, and type the commands as Check Your Results shows. The middle lines are the Data Reset again, so the table holds exactly its three contacts when the program starts.</w:t>
+        <w:t>Run the block from the lesson-5.1 folder, in a terminal that has SPA_DB_PASSWORD, and type the commands as Check Your Results shows. The middle lines run your language's reset file again, sql/reset_contacts_go.sql, so its table, contacts_go, holds exactly its three contacts when the program starts.</w:t>
       </w:r>
     </w:p>
     <w:p>
@@ -23819,7 +25451,7 @@
         <w:keepNext/>
       </w:pPr>
       <w:r>
-        <w:t xml:space="preserve">    -e "source ./sql/reset_contacts.sql"</w:t>
+        <w:t xml:space="preserve">    -e "source ./sql/reset_contacts_go.sql"</w:t>
       </w:r>
     </w:p>
     <w:p>
@@ -23885,7 +25517,7 @@
         <w:keepNext/>
       </w:pPr>
       <w:r>
-        <w:t>mysql -u devuser -h 127.0.0.1 -P 3306 -D spa_contacts &lt; ./sql/reset_contacts.sql</w:t>
+        <w:t>mysql -u devuser -h 127.0.0.1 -P 3306 -D spa_contacts \</w:t>
       </w:r>
     </w:p>
     <w:p>
@@ -23894,6 +25526,15 @@
         <w:keepNext/>
       </w:pPr>
       <w:r>
+        <w:t xml:space="preserve">    &lt; ./sql/reset_contacts_go.sql</w:t>
+      </w:r>
+    </w:p>
+    <w:p>
+      <w:pPr>
+        <w:pStyle w:val="CommandBlock"/>
+        <w:keepNext/>
+      </w:pPr>
+      <w:r>
         <w:t>unset MYSQL_PWD</w:t>
       </w:r>
     </w:p>
@@ -23929,7 +25570,7 @@
     </w:p>
     <w:p>
       <w:r>
-        <w:t>The block builds the program, resets the table to the Data Reset's three contacts, and runs it. Type the commands and answers of the Required Clean-Run Output in Validation Rules, as its first paragraph describes. Your screen must match the Required Clean-Run Output line for line, with the same spelling, spacing, and capitalization, and $LASTEXITCODE (echo $? on Linux or macOS) must print 0.</w:t>
+        <w:t>The block builds the program, resets your language's table to the Data Reset's three contacts, and runs it. Type the commands and answers of the Required Clean-Run Output in Validation Rules, as its first paragraph describes. Your screen must match the Required Clean-Run Output line for line, with the same spelling, spacing, and capitalization, and $LASTEXITCODE (echo $? on Linux or macOS) must print 0.</w:t>
       </w:r>
     </w:p>
     <w:p>
@@ -24232,7 +25873,7 @@
         <w:pStyle w:val="SourceCode"/>
       </w:pPr>
       <w:r>
-        <w:t>const insertContactSQL = "INSERT INTO contacts (name, email, phone) " +</w:t>
+        <w:t>const insertContactSQL = "INSERT INTO contacts_go (name, email, phone) " +</w:t>
       </w:r>
     </w:p>
     <w:p>
@@ -24248,7 +25889,7 @@
         <w:pStyle w:val="SourceCode"/>
       </w:pPr>
       <w:r>
-        <w:t>const selectContactSQL = "SELECT id, name, email, phone FROM contacts " +</w:t>
+        <w:t>const selectContactSQL = "SELECT id, name, email, phone FROM contacts_go " +</w:t>
       </w:r>
     </w:p>
     <w:p>
@@ -26891,7 +28532,7 @@
         <w:keepNext/>
       </w:pPr>
       <w:r>
-        <w:t xml:space="preserve">    -e "source ./sql/reset_contacts.sql"</w:t>
+        <w:t xml:space="preserve">    -e "source ./sql/reset_contacts_go.sql"</w:t>
       </w:r>
     </w:p>
     <w:p>
@@ -26957,7 +28598,7 @@
         <w:keepNext/>
       </w:pPr>
       <w:r>
-        <w:t>mysql -u devuser -h 127.0.0.1 -P 3306 -D spa_contacts &lt; ./sql/reset_contacts.sql</w:t>
+        <w:t>mysql -u devuser -h 127.0.0.1 -P 3306 -D spa_contacts \</w:t>
       </w:r>
     </w:p>
     <w:p>
@@ -26966,6 +28607,15 @@
         <w:keepNext/>
       </w:pPr>
       <w:r>
+        <w:t xml:space="preserve">    &lt; ./sql/reset_contacts_go.sql</w:t>
+      </w:r>
+    </w:p>
+    <w:p>
+      <w:pPr>
+        <w:pStyle w:val="CommandBlock"/>
+        <w:keepNext/>
+      </w:pPr>
+      <w:r>
         <w:t>unset MYSQL_PWD</w:t>
       </w:r>
     </w:p>
@@ -27001,7 +28651,7 @@
     </w:p>
     <w:p>
       <w:r>
-        <w:t>The block builds the program, resets the table to the Data Reset's three contacts, and runs it. Type the commands and answers of the Required Clean-Run Output in Validation Rules, as its first paragraph describes. Your screen must match the Required Clean-Run Output line for line, with the same spelling, spacing, and capitalization, and $LASTEXITCODE (echo $? on Linux or macOS) must print 0.</w:t>
+        <w:t>The block builds the program, resets your language's table to the Data Reset's three contacts, and runs it. Type the commands and answers of the Required Clean-Run Output in Validation Rules, as its first paragraph describes. Your screen must match the Required Clean-Run Output line for line, with the same spelling, spacing, and capitalization, and $LASTEXITCODE (echo $? on Linux or macOS) must print 0.</w:t>
       </w:r>
     </w:p>
     <w:p>
@@ -27472,7 +29122,15 @@
         <w:pStyle w:val="SourceCode"/>
       </w:pPr>
       <w:r>
-        <w:t>INSERT_CONTACT = ("INSERT INTO contacts (name, email, phone) "</w:t>
+        <w:t># Remember, contacts_python is Python's own table (Lesson 4.4).</w:t>
+      </w:r>
+    </w:p>
+    <w:p>
+      <w:pPr>
+        <w:pStyle w:val="SourceCode"/>
+      </w:pPr>
+      <w:r>
+        <w:t>INSERT_CONTACT = ("INSERT INTO contacts_python (name, email, phone) "</w:t>
       </w:r>
     </w:p>
     <w:p>
@@ -27488,7 +29146,15 @@
         <w:pStyle w:val="SourceCode"/>
       </w:pPr>
       <w:r>
-        <w:t>SELECT_CONTACT = "SELECT id, name, email, phone FROM contacts WHERE id = %s"</w:t>
+        <w:t>SELECT_CONTACT = ("SELECT id, name, email, phone FROM contacts_python "</w:t>
+      </w:r>
+    </w:p>
+    <w:p>
+      <w:pPr>
+        <w:pStyle w:val="SourceCode"/>
+      </w:pPr>
+      <w:r>
+        <w:t xml:space="preserve">                  "WHERE id = %s")</w:t>
       </w:r>
     </w:p>
     <w:p>
@@ -28870,7 +30536,7 @@
         <w:keepNext/>
       </w:pPr>
       <w:r>
-        <w:t>Run the block from the lesson-5.1 folder, in a terminal that has SPA_DB_PASSWORD, and type the commands as Check Your Results shows. The middle lines are the Data Reset again, so the table holds exactly its three contacts when the program starts. Python has no build step.</w:t>
+        <w:t>Run the block from the lesson-5.1 folder, in a terminal that has SPA_DB_PASSWORD, and type the commands as Check Your Results shows. The middle lines run your language's reset file again, sql/reset_contacts_python.sql, so its table, contacts_python, holds exactly its three contacts when the program starts. Python has no build step.</w:t>
       </w:r>
     </w:p>
     <w:p>
@@ -28911,7 +30577,7 @@
         <w:keepNext/>
       </w:pPr>
       <w:r>
-        <w:t xml:space="preserve">    -e "source ./sql/reset_contacts.sql"</w:t>
+        <w:t xml:space="preserve">    -e "source ./sql/reset_contacts_python.sql"</w:t>
       </w:r>
     </w:p>
     <w:p>
@@ -28968,7 +30634,7 @@
         <w:keepNext/>
       </w:pPr>
       <w:r>
-        <w:t>mysql -u devuser -h 127.0.0.1 -P 3306 -D spa_contacts &lt; ./sql/reset_contacts.sql</w:t>
+        <w:t>mysql -u devuser -h 127.0.0.1 -P 3306 -D spa_contacts \</w:t>
       </w:r>
     </w:p>
     <w:p>
@@ -28977,6 +30643,15 @@
         <w:keepNext/>
       </w:pPr>
       <w:r>
+        <w:t xml:space="preserve">    &lt; ./sql/reset_contacts_python.sql</w:t>
+      </w:r>
+    </w:p>
+    <w:p>
+      <w:pPr>
+        <w:pStyle w:val="CommandBlock"/>
+        <w:keepNext/>
+      </w:pPr>
+      <w:r>
         <w:t>unset MYSQL_PWD</w:t>
       </w:r>
     </w:p>
@@ -29012,7 +30687,7 @@
     </w:p>
     <w:p>
       <w:r>
-        <w:t>The block builds the program, resets the table to the Data Reset's three contacts, and runs it. Type the commands and answers of the Required Clean-Run Output in Validation Rules, as its first paragraph describes. Your screen must match the Required Clean-Run Output line for line, with the same spelling, spacing, and capitalization, and $LASTEXITCODE (echo $? on Linux or macOS) must print 0.</w:t>
+        <w:t>The block builds the program, resets your language's table to the Data Reset's three contacts, and runs it. Type the commands and answers of the Required Clean-Run Output in Validation Rules, as its first paragraph describes. Your screen must match the Required Clean-Run Output line for line, with the same spelling, spacing, and capitalization, and $LASTEXITCODE (echo $? on Linux or macOS) must print 0.</w:t>
       </w:r>
     </w:p>
     <w:p>
@@ -29241,7 +30916,7 @@
         <w:pStyle w:val="SourceCode"/>
       </w:pPr>
       <w:r>
-        <w:t>INSERT_CONTACT = ("INSERT INTO contacts (name, email, phone) "</w:t>
+        <w:t>INSERT_CONTACT = ("INSERT INTO contacts_python (name, email, phone) "</w:t>
       </w:r>
     </w:p>
     <w:p>
@@ -29257,7 +30932,15 @@
         <w:pStyle w:val="SourceCode"/>
       </w:pPr>
       <w:r>
-        <w:t>SELECT_CONTACT = "SELECT id, name, email, phone FROM contacts WHERE id = %s"</w:t>
+        <w:t>SELECT_CONTACT = ("SELECT id, name, email, phone FROM contacts_python "</w:t>
+      </w:r>
+    </w:p>
+    <w:p>
+      <w:pPr>
+        <w:pStyle w:val="SourceCode"/>
+      </w:pPr>
+      <w:r>
+        <w:t xml:space="preserve">                  "WHERE id = %s")</w:t>
       </w:r>
     </w:p>
     <w:p>
@@ -31389,7 +33072,7 @@
         <w:keepNext/>
       </w:pPr>
       <w:r>
-        <w:t xml:space="preserve">    -e "source ./sql/reset_contacts.sql"</w:t>
+        <w:t xml:space="preserve">    -e "source ./sql/reset_contacts_python.sql"</w:t>
       </w:r>
     </w:p>
     <w:p>
@@ -31446,7 +33129,7 @@
         <w:keepNext/>
       </w:pPr>
       <w:r>
-        <w:t>mysql -u devuser -h 127.0.0.1 -P 3306 -D spa_contacts &lt; ./sql/reset_contacts.sql</w:t>
+        <w:t>mysql -u devuser -h 127.0.0.1 -P 3306 -D spa_contacts \</w:t>
       </w:r>
     </w:p>
     <w:p>
@@ -31455,6 +33138,15 @@
         <w:keepNext/>
       </w:pPr>
       <w:r>
+        <w:t xml:space="preserve">    &lt; ./sql/reset_contacts_python.sql</w:t>
+      </w:r>
+    </w:p>
+    <w:p>
+      <w:pPr>
+        <w:pStyle w:val="CommandBlock"/>
+        <w:keepNext/>
+      </w:pPr>
+      <w:r>
         <w:t>unset MYSQL_PWD</w:t>
       </w:r>
     </w:p>
@@ -31490,7 +33182,7 @@
     </w:p>
     <w:p>
       <w:r>
-        <w:t>The block builds the program, resets the table to the Data Reset's three contacts, and runs it. Type the commands and answers of the Required Clean-Run Output in Validation Rules, as its first paragraph describes. Your screen must match the Required Clean-Run Output line for line, with the same spelling, spacing, and capitalization, and $LASTEXITCODE (echo $? on Linux or macOS) must print 0.</w:t>
+        <w:t>The block builds the program, resets your language's table to the Data Reset's three contacts, and runs it. Type the commands and answers of the Required Clean-Run Output in Validation Rules, as its first paragraph describes. Your screen must match the Required Clean-Run Output line for line, with the same spelling, spacing, and capitalization, and $LASTEXITCODE (echo $? on Linux or macOS) must print 0.</w:t>
       </w:r>
     </w:p>
     <w:p>
@@ -31980,6 +33672,14 @@
         <w:pStyle w:val="SourceCode"/>
       </w:pPr>
       <w:r>
+        <w:t>// Remember, contacts_typescript is TypeScript's own table (Lesson 4.4).</w:t>
+      </w:r>
+    </w:p>
+    <w:p>
+      <w:pPr>
+        <w:pStyle w:val="SourceCode"/>
+      </w:pPr>
+      <w:r>
         <w:t>const INSERT_CONTACT: string =</w:t>
       </w:r>
     </w:p>
@@ -31988,7 +33688,7 @@
         <w:pStyle w:val="SourceCode"/>
       </w:pPr>
       <w:r>
-        <w:t xml:space="preserve">    "INSERT INTO contacts (name, email, phone) VALUES (?, ?, ?)";</w:t>
+        <w:t xml:space="preserve">    "INSERT INTO contacts_typescript (name, email, phone) VALUES (?, ?, ?)";</w:t>
       </w:r>
     </w:p>
     <w:p>
@@ -32004,7 +33704,7 @@
         <w:pStyle w:val="SourceCode"/>
       </w:pPr>
       <w:r>
-        <w:t xml:space="preserve">    "SELECT id, name, email, phone FROM contacts WHERE id = ?";</w:t>
+        <w:t xml:space="preserve">    "SELECT id, name, email, phone FROM contacts_typescript WHERE id = ?";</w:t>
       </w:r>
     </w:p>
     <w:p>
@@ -33693,7 +35393,7 @@
         <w:keepNext/>
       </w:pPr>
       <w:r>
-        <w:t>Run the block from the lesson-5.1 folder, in a terminal that has SPA_DB_PASSWORD, and type the commands as Check Your Results shows. The middle lines are the Data Reset again, so the table holds exactly its three contacts when the program starts.</w:t>
+        <w:t>Run the block from the lesson-5.1 folder, in a terminal that has SPA_DB_PASSWORD, and type the commands as Check Your Results shows. The middle lines run your language's reset file again, sql/reset_contacts_typescript.sql, so its table, contacts_typescript, holds exactly its three contacts when the program starts.</w:t>
       </w:r>
     </w:p>
     <w:p>
@@ -33752,7 +35452,7 @@
         <w:keepNext/>
       </w:pPr>
       <w:r>
-        <w:t xml:space="preserve">    -e "source ./sql/reset_contacts.sql"</w:t>
+        <w:t xml:space="preserve">    -e "source ./sql/reset_contacts_typescript.sql"</w:t>
       </w:r>
     </w:p>
     <w:p>
@@ -33827,7 +35527,7 @@
         <w:keepNext/>
       </w:pPr>
       <w:r>
-        <w:t>mysql -u devuser -h 127.0.0.1 -P 3306 -D spa_contacts &lt; ./sql/reset_contacts.sql</w:t>
+        <w:t>mysql -u devuser -h 127.0.0.1 -P 3306 -D spa_contacts \</w:t>
       </w:r>
     </w:p>
     <w:p>
@@ -33836,6 +35536,15 @@
         <w:keepNext/>
       </w:pPr>
       <w:r>
+        <w:t xml:space="preserve">    &lt; ./sql/reset_contacts_typescript.sql</w:t>
+      </w:r>
+    </w:p>
+    <w:p>
+      <w:pPr>
+        <w:pStyle w:val="CommandBlock"/>
+        <w:keepNext/>
+      </w:pPr>
+      <w:r>
         <w:t>unset MYSQL_PWD</w:t>
       </w:r>
     </w:p>
@@ -33871,7 +35580,7 @@
     </w:p>
     <w:p>
       <w:r>
-        <w:t>The npm check and build steps print their own lines first; those are not part of the program's output. The block builds the program, resets the table to the Data Reset's three contacts, and runs it. Type the commands and answers of the Required Clean-Run Output in Validation Rules, as its first paragraph describes. Your screen must match the Required Clean-Run Output line for line, with the same spelling, spacing, and capitalization, and $LASTEXITCODE (echo $? on Linux or macOS) must print 0.</w:t>
+        <w:t>The npm check and build steps print their own lines first; those are not part of the program's output. The block builds the program, resets your language's table to the Data Reset's three contacts, and runs it. Type the commands and answers of the Required Clean-Run Output in Validation Rules, as its first paragraph describes. Your screen must match the Required Clean-Run Output line for line, with the same spelling, spacing, and capitalization, and $LASTEXITCODE (echo $? on Linux or macOS) must print 0.</w:t>
       </w:r>
     </w:p>
     <w:p>
@@ -34119,7 +35828,7 @@
         <w:pStyle w:val="SourceCode"/>
       </w:pPr>
       <w:r>
-        <w:t xml:space="preserve">    "INSERT INTO contacts (name, email, phone) VALUES (?, ?, ?)";</w:t>
+        <w:t xml:space="preserve">    "INSERT INTO contacts_typescript (name, email, phone) VALUES (?, ?, ?)";</w:t>
       </w:r>
     </w:p>
     <w:p>
@@ -34135,7 +35844,7 @@
         <w:pStyle w:val="SourceCode"/>
       </w:pPr>
       <w:r>
-        <w:t xml:space="preserve">    "SELECT id, name, email, phone FROM contacts WHERE id = ?";</w:t>
+        <w:t xml:space="preserve">    "SELECT id, name, email, phone FROM contacts_typescript WHERE id = ?";</w:t>
       </w:r>
     </w:p>
     <w:p>
@@ -36814,7 +38523,7 @@
         <w:keepNext/>
       </w:pPr>
       <w:r>
-        <w:t xml:space="preserve">    -e "source ./sql/reset_contacts.sql"</w:t>
+        <w:t xml:space="preserve">    -e "source ./sql/reset_contacts_typescript.sql"</w:t>
       </w:r>
     </w:p>
     <w:p>
@@ -36889,7 +38598,7 @@
         <w:keepNext/>
       </w:pPr>
       <w:r>
-        <w:t>mysql -u devuser -h 127.0.0.1 -P 3306 -D spa_contacts &lt; ./sql/reset_contacts.sql</w:t>
+        <w:t>mysql -u devuser -h 127.0.0.1 -P 3306 -D spa_contacts \</w:t>
       </w:r>
     </w:p>
     <w:p>
@@ -36898,6 +38607,15 @@
         <w:keepNext/>
       </w:pPr>
       <w:r>
+        <w:t xml:space="preserve">    &lt; ./sql/reset_contacts_typescript.sql</w:t>
+      </w:r>
+    </w:p>
+    <w:p>
+      <w:pPr>
+        <w:pStyle w:val="CommandBlock"/>
+        <w:keepNext/>
+      </w:pPr>
+      <w:r>
         <w:t>unset MYSQL_PWD</w:t>
       </w:r>
     </w:p>
@@ -36933,7 +38651,7 @@
     </w:p>
     <w:p>
       <w:r>
-        <w:t>The npm check and build steps print their own lines first; those are not part of the program's output. The block builds the program, resets the table to the Data Reset's three contacts, and runs it. Type the commands and answers of the Required Clean-Run Output in Validation Rules, as its first paragraph describes. Your screen must match the Required Clean-Run Output line for line, with the same spelling, spacing, and capitalization, and $LASTEXITCODE (echo $? on Linux or macOS) must print 0.</w:t>
+        <w:t>The npm check and build steps print their own lines first; those are not part of the program's output. The block builds the program, resets your language's table to the Data Reset's three contacts, and runs it. Type the commands and answers of the Required Clean-Run Output in Validation Rules, as its first paragraph describes. Your screen must match the Required Clean-Run Output line for line, with the same spelling, spacing, and capitalization, and $LASTEXITCODE (echo $? on Linux or macOS) must print 0.</w:t>
       </w:r>
     </w:p>
     <w:p>
@@ -37698,7 +39416,7 @@
         <w:pStyle w:val="ListBullet"/>
       </w:pPr>
       <w:r>
-        <w:t>Each Build and Run block resets the table first, so every run starts from the Data Reset's three contacts.</w:t>
+        <w:t>Each Build and Run block resets its language's own table first, so every run starts from the Data Reset's three contacts.</w:t>
       </w:r>
     </w:p>
     <w:p>
@@ -38307,7 +40025,7 @@
     </w:p>
     <w:p>
       <w:r>
-        <w:t>Run this right after a language's Production-Minded typed run and its Ended Input Check, before the Exercise, and ask the server what it stored, from the mysql client: a second connection, separate from the program's.</w:t>
+        <w:t>Run this right after a language's Production-Minded typed run and its Ended Input Check, before the Exercise, and ask the server what it stored, from the mysql client: a second connection, separate from the program's. The block shows the C programs' table, contacts_c; for another language, put its own table, such as contacts_go, in place of contacts_c.</w:t>
       </w:r>
     </w:p>
     <w:p>
@@ -38356,7 +40074,7 @@
         <w:keepNext/>
       </w:pPr>
       <w:r>
-        <w:t xml:space="preserve">    -e "SELECT id, name, email, phone FROM contacts ORDER BY id"</w:t>
+        <w:t xml:space="preserve">    -e "SELECT id, name, email, phone FROM contacts_c ORDER BY id"</w:t>
       </w:r>
     </w:p>
     <w:p>
@@ -38404,7 +40122,7 @@
         <w:keepNext/>
       </w:pPr>
       <w:r>
-        <w:t xml:space="preserve">    -e "SELECT id, name, email, phone FROM contacts ORDER BY id"</w:t>
+        <w:t xml:space="preserve">    -e "SELECT id, name, email, phone FROM contacts_c ORDER BY id"</w:t>
       </w:r>
     </w:p>
     <w:p>
@@ -38425,7 +40143,7 @@
         <w:keepNext/>
       </w:pPr>
       <w:r>
-        <w:t>The query prints this table:</w:t>
+        <w:t>The query prints this table, for every language's table:</w:t>
       </w:r>
     </w:p>
     <w:p>
@@ -39766,31 +41484,31 @@
       </w:rPr>
     </w:lvl>
   </w:abstractNum>
-  <w:num w:numId="1" w16cid:durableId="1307468179">
+  <w:num w:numId="1" w16cid:durableId="320473178">
     <w:abstractNumId w:val="8"/>
   </w:num>
-  <w:num w:numId="2" w16cid:durableId="835191671">
+  <w:num w:numId="2" w16cid:durableId="768283177">
     <w:abstractNumId w:val="6"/>
   </w:num>
-  <w:num w:numId="3" w16cid:durableId="1653943680">
+  <w:num w:numId="3" w16cid:durableId="703748719">
     <w:abstractNumId w:val="5"/>
   </w:num>
-  <w:num w:numId="4" w16cid:durableId="1735274266">
+  <w:num w:numId="4" w16cid:durableId="1921788376">
     <w:abstractNumId w:val="4"/>
   </w:num>
-  <w:num w:numId="5" w16cid:durableId="1196966653">
+  <w:num w:numId="5" w16cid:durableId="77141876">
     <w:abstractNumId w:val="7"/>
   </w:num>
-  <w:num w:numId="6" w16cid:durableId="538399421">
+  <w:num w:numId="6" w16cid:durableId="1598706523">
     <w:abstractNumId w:val="3"/>
   </w:num>
-  <w:num w:numId="7" w16cid:durableId="229266836">
+  <w:num w:numId="7" w16cid:durableId="792137476">
     <w:abstractNumId w:val="2"/>
   </w:num>
-  <w:num w:numId="8" w16cid:durableId="1887184470">
+  <w:num w:numId="8" w16cid:durableId="1353069082">
     <w:abstractNumId w:val="1"/>
   </w:num>
-  <w:num w:numId="9" w16cid:durableId="651567117">
+  <w:num w:numId="9" w16cid:durableId="693383756">
     <w:abstractNumId w:val="0"/>
   </w:num>
 </w:numbering>

</xml_diff>